<commit_message>
Update research paper document
</commit_message>
<xml_diff>
--- a/Responsible_Robot_Research_paper_v3.0.docx
+++ b/Responsible_Robot_Research_paper_v3.0.docx
@@ -33,13 +33,15 @@
         <w:jc w:val="center"/>
         <w:rPr>
           <w:rFonts w:hint="eastAsia"/>
-        </w:rPr>
-      </w:pPr>
-      <w:r>
-        <w:rPr>
           <w:color w:val="464646"/>
           <w:sz w:val="30"/>
         </w:rPr>
+      </w:pPr>
+      <w:r>
+        <w:rPr>
+          <w:color w:val="464646"/>
+          <w:sz w:val="30"/>
+        </w:rPr>
         <w:t>Testing predictive control, supervisory AI, and a human–robot coordination protocol</w:t>
       </w:r>
     </w:p>
@@ -76,9 +78,6 @@
     <w:p>
       <w:pPr>
         <w:jc w:val="center"/>
-        <w:rPr>
-          <w:rFonts w:hint="eastAsia"/>
-        </w:rPr>
       </w:pPr>
       <w:r>
         <w:t>Prepared for collaboration discussion with robotics and Physical AI colleagues</w:t>
@@ -86,6 +85,20 @@
       <w:r>
         <w:br/>
         <w:t>September 2026</w:t>
+      </w:r>
+    </w:p>
+    <w:p>
+      <w:pPr>
+        <w:jc w:val="center"/>
+        <w:rPr>
+          <w:rFonts w:hint="eastAsia"/>
+        </w:rPr>
+      </w:pPr>
+      <w:r>
+        <w:t>By Divya Jain, Paolo</w:t>
+      </w:r>
+      <w:r>
+        <w:t xml:space="preserve"> Di Prodi</w:t>
       </w:r>
     </w:p>
     <w:tbl>
@@ -203,13 +216,13 @@
         </w:rPr>
       </w:pPr>
       <w:r>
-        <w:t xml:space="preserve">H1 </w:t>
-      </w:r>
-      <w:r>
-        <w:t xml:space="preserve">, </w:t>
-      </w:r>
-      <w:r>
-        <w:t xml:space="preserve"> Predictive control: adding an MPC/CBF-style runtime safety filter to a learned robot policy will reduce critical physical-safety constraint violations versus the learned policy alone, while state-estimation error, model mismatch and latency remain within defined bounds.</w:t>
+        <w:t>H1</w:t>
+      </w:r>
+      <w:r>
+        <w:t xml:space="preserve">ss </w:t>
+      </w:r>
+      <w:r>
+        <w:t>Predictive control: adding an MPC/CBF-style runtime safety filter to a learned robot policy will reduce critical physical-safety constraint violations versus the learned policy alone, while state-estimation error, model mismatch and latency remain within defined bounds.</w:t>
       </w:r>
     </w:p>
     <w:p>
@@ -220,13 +233,16 @@
         </w:rPr>
       </w:pPr>
       <w:r>
-        <w:t xml:space="preserve">H2 </w:t>
-      </w:r>
-      <w:r>
-        <w:t xml:space="preserve">, </w:t>
-      </w:r>
-      <w:r>
-        <w:t xml:space="preserve"> Supervisory AI: adding a functionally independent supervisory model above the worker/action model, with authority to authorize, modify, delay or veto actions using a structured risk policy, will reduce semantically unsafe action initiation beyond an MPC/CBF-only baseline.</w:t>
+        <w:t>H2</w:t>
+      </w:r>
+      <w:r>
+        <w:t>,</w:t>
+      </w:r>
+      <w:r>
+        <w:t>ss</w:t>
+      </w:r>
+      <w:r>
+        <w:t>Supervisory AI: adding a functionally independent supervisory model above the worker/action model, with authority to authorize, modify, delay or veto actions using a structured risk policy, will reduce semantically unsafe action initiation beyond an MPC/CBF-only baseline.</w:t>
       </w:r>
     </w:p>
     <w:p>
@@ -237,13 +253,16 @@
         </w:rPr>
       </w:pPr>
       <w:r>
-        <w:t xml:space="preserve">H3 </w:t>
-      </w:r>
-      <w:r>
-        <w:t xml:space="preserve">, </w:t>
-      </w:r>
-      <w:r>
-        <w:t xml:space="preserve"> Human–robot coordination: adding a standardized, risk-adaptive intent/consent protocol that combines secure machine-readable messages with human-observable multimodal signals will reduce unsafe coordination events and improve correct anticipation of robot actions in shared spaces compared with ad-hoc or unimodal signaling.</w:t>
+        <w:t>H3</w:t>
+      </w:r>
+      <w:r>
+        <w:t>,</w:t>
+      </w:r>
+      <w:r>
+        <w:t xml:space="preserve"> </w:t>
+      </w:r>
+      <w:r>
+        <w:t>Human–robot coordination: adding a standardized, risk-adaptive intent/consent protocol that combines secure machine-readable messages with human-observable multimodal signals will reduce unsafe coordination events and improve correct anticipation of robot actions in shared spaces compared with ad-hoc or unimodal signaling.</w:t>
       </w:r>
     </w:p>
     <w:p>
@@ -343,10 +362,7 @@
         <w:t xml:space="preserve">Current industry direction already points toward layered assurance. </w:t>
       </w:r>
       <w:r>
-        <w:t>Google DeepMind describes Gemini Robotics safety as a multi-layer stack combining semantic, physical and operational safeguards, and its 2026 Gemini Robotics 2 work introduces ASIMOV-Agentic to test refusal of unsafe robot tool calls, protective intervention, feasibility/OOD shielding and requests for human help under uncertainty. Agility Robotics describes Digit 5 as using cooperative-safety features for close-proximity work, while OWASP’s 2026 Agent Control Standard focuses on runtime control hooks for AI</w:t>
-      </w:r>
-      <w:r>
-        <w:t xml:space="preserve"> agents. Anthropic’s Model Hardware Standard similarly places a controlled interface between agents and physical devices. These developments support a defence-in-depth research framing rather than a single-controller claim.</w:t>
+        <w:t>Google DeepMind describes Gemini Robotics safety as a multi-layer stack combining semantic, physical and operational safeguards, and its 2026 Gemini Robotics 2 work introduces ASIMOV-Agentic to test refusal of unsafe robot tool calls, protective intervention, feasibility/OOD shielding and requests for human help under uncertainty. Agility Robotics describes Digit 5 as using cooperative-safety features for close-proximity work, while OWASP’s 2026 Agent Control Standard focuses on runtime control hooks for AI agents. Anthropic’s Model Hardware Standard similarly places a controlled interface between agents and physical devices. These developments support a defence-in-depth research framing rather than a single-controller claim.</w:t>
       </w:r>
     </w:p>
     <w:p>
@@ -469,13 +485,16 @@
         <w:pStyle w:val="Heading2"/>
       </w:pPr>
       <w:r>
-        <w:t xml:space="preserve">H1 </w:t>
-      </w:r>
-      <w:r>
-        <w:t xml:space="preserve">, </w:t>
-      </w:r>
-      <w:r>
-        <w:t xml:space="preserve"> Predictive safety filtering</w:t>
+        <w:t>H1</w:t>
+      </w:r>
+      <w:r>
+        <w:t>,</w:t>
+      </w:r>
+      <w:r>
+        <w:t xml:space="preserve"> </w:t>
+      </w:r>
+      <w:r>
+        <w:t>Predictive safety filtering</w:t>
       </w:r>
     </w:p>
     <w:p>
@@ -533,10 +552,7 @@
         </w:rPr>
       </w:pPr>
       <w:r>
-        <w:t xml:space="preserve">Let x(t) be the estimated robot/environment state, u_worker(t) the command proposed by the learned worker policy, u(t) the applied control, f̂ the dynamics model, H the prediction horizon, and hⱼ(x) ≥ 0 the j-th safe-set constraint. A </w:t>
-      </w:r>
-      <w:r>
-        <w:t>constrained MPC safety filter can be written as:</w:t>
+        <w:t>Let x(t) be the estimated robot/environment state, u_worker(t) the command proposed by the learned worker policy, u(t) the applied control, f̂ the dynamics model, H the prediction horizon, and hⱼ(x) ≥ 0 the j-th safe-set constraint. A constrained MPC safety filter can be written as:</w:t>
       </w:r>
     </w:p>
     <w:p>
@@ -545,7 +561,25 @@
         <w:jc w:val="center"/>
       </w:pPr>
       <w:r>
-        <w:t>u_safe(t) = arg min  Σₖ [ ‖x(k) − x_ref‖²_Q  +  ‖u(k) − u_worker(k)‖²_R ]</w:t>
+        <w:t>u_safe(t) = arg min</w:t>
+      </w:r>
+      <w:r>
+        <w:t xml:space="preserve"> </w:t>
+      </w:r>
+      <w:r>
+        <w:t>Σₖ [ ‖x(k) − x_ref‖²_Q</w:t>
+      </w:r>
+      <w:r>
+        <w:t xml:space="preserve"> </w:t>
+      </w:r>
+      <w:r>
+        <w:t>+</w:t>
+      </w:r>
+      <w:r>
+        <w:t xml:space="preserve"> </w:t>
+      </w:r>
+      <w:r>
+        <w:t>‖u(k) − u_worker(k)‖²_R ]</w:t>
       </w:r>
     </w:p>
     <w:p>
@@ -554,13 +588,43 @@
         <w:jc w:val="center"/>
       </w:pPr>
       <w:r>
-        <w:t xml:space="preserve">subject to  x(k+1)=f̂(x(k),u(k));  u(k)∈U;  hⱼ(x(k))≥0;  and optionally  </w:t>
-      </w:r>
-      <w:r>
-        <w:t>ḣⱼ</w:t>
-      </w:r>
-      <w:r>
-        <w:t>(x(k),u(k)) + αⱼhⱼ(x(k)) ≥ 0  (CBF).</w:t>
+        <w:t>subject to</w:t>
+      </w:r>
+      <w:r>
+        <w:t xml:space="preserve"> </w:t>
+      </w:r>
+      <w:r>
+        <w:t>x(k+1)=f̂(x(k),u(k));</w:t>
+      </w:r>
+      <w:r>
+        <w:t xml:space="preserve"> </w:t>
+      </w:r>
+      <w:r>
+        <w:t>u(k)∈U;</w:t>
+      </w:r>
+      <w:r>
+        <w:t xml:space="preserve"> </w:t>
+      </w:r>
+      <w:r>
+        <w:t>hⱼ(x(k))≥0;</w:t>
+      </w:r>
+      <w:r>
+        <w:t xml:space="preserve"> </w:t>
+      </w:r>
+      <w:r>
+        <w:t>and optionally</w:t>
+      </w:r>
+      <w:r>
+        <w:t xml:space="preserve"> </w:t>
+      </w:r>
+      <w:r>
+        <w:t>ḣⱼ(x(k),u(k)) + αⱼhⱼ(x(k)) ≥ 0</w:t>
+      </w:r>
+      <w:r>
+        <w:t xml:space="preserve"> </w:t>
+      </w:r>
+      <w:r>
+        <w:t>(CBF).</w:t>
       </w:r>
     </w:p>
     <w:p>
@@ -587,7 +651,25 @@
         <w:jc w:val="center"/>
       </w:pPr>
       <w:r>
-        <w:t>H1 directional test:  λ_CSVR(on | B₁)  &lt;  λ_CSVR(off | B₁)</w:t>
+        <w:t>H1 directional test:</w:t>
+      </w:r>
+      <w:r>
+        <w:t xml:space="preserve"> </w:t>
+      </w:r>
+      <w:r>
+        <w:t>λ_CSVR(on | B₁)</w:t>
+      </w:r>
+      <w:r>
+        <w:t xml:space="preserve"> </w:t>
+      </w:r>
+      <w:r>
+        <w:t>&lt;</w:t>
+      </w:r>
+      <w:r>
+        <w:t xml:space="preserve"> </w:t>
+      </w:r>
+      <w:r>
+        <w:t>λ_CSVR(off | B₁)</w:t>
       </w:r>
     </w:p>
     <w:p>
@@ -643,10 +725,13 @@
         <w:t>AMBER: predicted margin approaches a limit or uncertainty rises</w:t>
       </w:r>
       <w:r>
-        <w:t xml:space="preserve">, </w:t>
-      </w:r>
-      <w:r>
-        <w:t xml:space="preserve"> reduce speed/force, reshape the trajectory or increase separation.</w:t>
+        <w:t>,</w:t>
+      </w:r>
+      <w:r>
+        <w:t xml:space="preserve"> </w:t>
+      </w:r>
+      <w:r>
+        <w:t>reduce speed/force, reshape the trajectory or increase separation.</w:t>
       </w:r>
     </w:p>
     <w:p>
@@ -661,10 +746,13 @@
         <w:t>RED: constraints are infeasible, estimated risk exceeds threshold, or the controller deadline is missed</w:t>
       </w:r>
       <w:r>
-        <w:t xml:space="preserve">, </w:t>
-      </w:r>
-      <w:r>
-        <w:t xml:space="preserve"> transition to the independent safe-state path rather than “trying harder” with the learned policy.</w:t>
+        <w:t>,</w:t>
+      </w:r>
+      <w:r>
+        <w:t xml:space="preserve"> </w:t>
+      </w:r>
+      <w:r>
+        <w:t>transition to the independent safe-state path rather than “trying harder” with the learned policy.</w:t>
       </w:r>
     </w:p>
     <w:p>
@@ -773,13 +861,19 @@
         <w:jc w:val="center"/>
       </w:pPr>
       <w:r>
-        <w:t>r(t) = σ[ w</w:t>
-      </w:r>
-      <w:r>
-        <w:t>ᵀ</w:t>
-      </w:r>
-      <w:r>
-        <w:t xml:space="preserve"> φ(z(t)) ]  ∈  [0,1]</w:t>
+        <w:t>r(t) = σ[ wᵀ φ(z(t)) ]</w:t>
+      </w:r>
+      <w:r>
+        <w:t xml:space="preserve"> </w:t>
+      </w:r>
+      <w:r>
+        <w:t>∈</w:t>
+      </w:r>
+      <w:r>
+        <w:t xml:space="preserve"> </w:t>
+      </w:r>
+      <w:r>
+        <w:t>[0,1]</w:t>
       </w:r>
     </w:p>
     <w:p>
@@ -809,7 +903,25 @@
         <w:jc w:val="center"/>
       </w:pPr>
       <w:r>
-        <w:t>H2 directional test:  P(UAI=1 | supervisor on, B₂)  &lt;  P(UAI=1 | supervisor off, B₂)</w:t>
+        <w:t>H2 directional test:</w:t>
+      </w:r>
+      <w:r>
+        <w:t xml:space="preserve"> </w:t>
+      </w:r>
+      <w:r>
+        <w:t>P(UAI=1 | supervisor on, B₂)</w:t>
+      </w:r>
+      <w:r>
+        <w:t xml:space="preserve"> </w:t>
+      </w:r>
+      <w:r>
+        <w:t>&lt;</w:t>
+      </w:r>
+      <w:r>
+        <w:t xml:space="preserve"> </w:t>
+      </w:r>
+      <w:r>
+        <w:t>P(UAI=1 | supervisor off, B₂)</w:t>
       </w:r>
     </w:p>
     <w:p>
@@ -856,13 +968,16 @@
         </w:rPr>
       </w:pPr>
       <w:r>
-        <w:t xml:space="preserve">θ₁ ≤ r(t) &lt; θ₂: inject caution </w:t>
-      </w:r>
-      <w:r>
-        <w:t xml:space="preserve">, </w:t>
-      </w:r>
-      <w:r>
-        <w:t xml:space="preserve"> slow, constrain, require a pre-action simulation or request more context.</w:t>
+        <w:t>θ₁ ≤ r(t) &lt; θ₂: inject caution</w:t>
+      </w:r>
+      <w:r>
+        <w:t>,</w:t>
+      </w:r>
+      <w:r>
+        <w:t xml:space="preserve"> </w:t>
+      </w:r>
+      <w:r>
+        <w:t>slow, constrain, require a pre-action simulation or request more context.</w:t>
       </w:r>
     </w:p>
     <w:p>
@@ -909,10 +1024,13 @@
         <w:t>H3</w:t>
       </w:r>
       <w:r>
-        <w:t xml:space="preserve">, </w:t>
-      </w:r>
-      <w:r>
-        <w:t xml:space="preserve"> Human–Robot Coordination Protocol (HRCP)</w:t>
+        <w:t>,</w:t>
+      </w:r>
+      <w:r>
+        <w:t xml:space="preserve"> </w:t>
+      </w:r>
+      <w:r>
+        <w:t>Human–Robot Coordination Protocol (HRCP)</w:t>
       </w:r>
     </w:p>
     <w:p>
@@ -1004,7 +1122,25 @@
         <w:jc w:val="center"/>
       </w:pPr>
       <w:r>
-        <w:t>H3 directional test:  E[CCR | HRCP on, B₃] &lt; E[CCR | HRCP off, B₃]   and   E[Comprehension | on] &gt; E[Comprehension | off]</w:t>
+        <w:t>H3 directional test:</w:t>
+      </w:r>
+      <w:r>
+        <w:t xml:space="preserve"> </w:t>
+      </w:r>
+      <w:r>
+        <w:t>E[CCR | HRCP on, B₃] &lt; E[CCR | HRCP off, B₃]</w:t>
+      </w:r>
+      <w:r>
+        <w:t xml:space="preserve"> </w:t>
+      </w:r>
+      <w:r>
+        <w:t xml:space="preserve"> and</w:t>
+      </w:r>
+      <w:r>
+        <w:t xml:space="preserve"> </w:t>
+      </w:r>
+      <w:r>
+        <w:t xml:space="preserve"> E[Comprehension | on] &gt; E[Comprehension | off]</w:t>
       </w:r>
     </w:p>
     <w:p>
@@ -1179,13 +1315,16 @@
         </w:rPr>
       </w:pPr>
       <w:r>
-        <w:t xml:space="preserve">Should this task/action be allowed in the present context? </w:t>
-      </w:r>
-      <w:r>
-        <w:t xml:space="preserve">, </w:t>
-      </w:r>
-      <w:r>
-        <w:t xml:space="preserve"> semantic supervisor (H2).</w:t>
+        <w:t>Should this task/action be allowed in the present context?</w:t>
+      </w:r>
+      <w:r>
+        <w:t>,</w:t>
+      </w:r>
+      <w:r>
+        <w:t xml:space="preserve"> </w:t>
+      </w:r>
+      <w:r>
+        <w:t>semantic supervisor (H2).</w:t>
       </w:r>
     </w:p>
     <w:p>
@@ -1196,13 +1335,16 @@
         </w:rPr>
       </w:pPr>
       <w:r>
-        <w:t xml:space="preserve">Do affected humans need to be informed, consulted or given a chance to modify/deny? </w:t>
-      </w:r>
-      <w:r>
-        <w:t xml:space="preserve">, </w:t>
-      </w:r>
-      <w:r>
-        <w:t xml:space="preserve"> HRCP (H3).</w:t>
+        <w:t>Do affected humans need to be informed, consulted or given a chance to modify/deny?</w:t>
+      </w:r>
+      <w:r>
+        <w:t>,</w:t>
+      </w:r>
+      <w:r>
+        <w:t xml:space="preserve"> </w:t>
+      </w:r>
+      <w:r>
+        <w:t>HRCP (H3).</w:t>
       </w:r>
     </w:p>
     <w:p>
@@ -1213,13 +1355,16 @@
         </w:rPr>
       </w:pPr>
       <w:r>
-        <w:t xml:space="preserve">Is the proposed trajectory/control dynamically safe and feasible? </w:t>
-      </w:r>
-      <w:r>
-        <w:t xml:space="preserve">, </w:t>
-      </w:r>
-      <w:r>
-        <w:t xml:space="preserve"> MPC/CBF safety filter (H1).</w:t>
+        <w:t>Is the proposed trajectory/control dynamically safe and feasible?</w:t>
+      </w:r>
+      <w:r>
+        <w:t>,</w:t>
+      </w:r>
+      <w:r>
+        <w:t xml:space="preserve"> </w:t>
+      </w:r>
+      <w:r>
+        <w:t>MPC/CBF safety filter (H1).</w:t>
       </w:r>
     </w:p>
     <w:p>
@@ -1230,13 +1375,16 @@
         </w:rPr>
       </w:pPr>
       <w:r>
-        <w:t xml:space="preserve">Can the machine be forced into a safe state even when the learned components fail? </w:t>
-      </w:r>
-      <w:r>
-        <w:t xml:space="preserve">, </w:t>
-      </w:r>
-      <w:r>
-        <w:t xml:space="preserve"> independent hard real-time safety kernel.</w:t>
+        <w:t>Can the machine be forced into a safe state even when the learned components fail?</w:t>
+      </w:r>
+      <w:r>
+        <w:t>,</w:t>
+      </w:r>
+      <w:r>
+        <w:t xml:space="preserve"> </w:t>
+      </w:r>
+      <w:r>
+        <w:t>independent hard real-time safety kernel.</w:t>
       </w:r>
     </w:p>
     <w:p>
@@ -2761,23 +2909,20 @@
           <w:sz w:val="17"/>
         </w:rPr>
         <w:br/>
-        <w:t xml:space="preserve">  "protocol": "HRCP/0.1",</w:t>
       </w:r>
       <w:r>
         <w:rPr>
           <w:rFonts w:ascii="Liberation Mono" w:hAnsi="Liberation Mono"/>
           <w:sz w:val="17"/>
         </w:rPr>
-        <w:br/>
-        <w:t xml:space="preserve">  "robot_id": "robot-17",</w:t>
+        <w:t xml:space="preserve"> </w:t>
       </w:r>
       <w:r>
         <w:rPr>
           <w:rFonts w:ascii="Liberation Mono" w:hAnsi="Liberation Mono"/>
           <w:sz w:val="17"/>
         </w:rPr>
-        <w:br/>
-        <w:t xml:space="preserve">  "intent": "MOVE_PALLET",</w:t>
+        <w:t>"protocol": "HRCP/0.1",</w:t>
       </w:r>
       <w:r>
         <w:rPr>
@@ -2791,16 +2936,14 @@
           <w:rFonts w:ascii="Liberation Mono" w:hAnsi="Liberation Mono"/>
           <w:sz w:val="17"/>
         </w:rPr>
-        <w:lastRenderedPageBreak/>
-        <w:t xml:space="preserve">  "risk_tier": "R2",</w:t>
+        <w:t xml:space="preserve"> </w:t>
       </w:r>
       <w:r>
         <w:rPr>
           <w:rFonts w:ascii="Liberation Mono" w:hAnsi="Liberation Mono"/>
           <w:sz w:val="17"/>
         </w:rPr>
-        <w:br/>
-        <w:t xml:space="preserve">  "affected_zone": {"type": "polygon", "frame": "map"},</w:t>
+        <w:t>"robot_id": "robot-17",</w:t>
       </w:r>
       <w:r>
         <w:rPr>
@@ -2808,23 +2951,20 @@
           <w:sz w:val="17"/>
         </w:rPr>
         <w:br/>
-        <w:t xml:space="preserve">  "start_after_ms": 1500,</w:t>
       </w:r>
       <w:r>
         <w:rPr>
           <w:rFonts w:ascii="Liberation Mono" w:hAnsi="Liberation Mono"/>
           <w:sz w:val="17"/>
         </w:rPr>
-        <w:br/>
-        <w:t xml:space="preserve">  "expected_duration_ms": 6000,</w:t>
+        <w:t xml:space="preserve"> </w:t>
       </w:r>
       <w:r>
         <w:rPr>
           <w:rFonts w:ascii="Liberation Mono" w:hAnsi="Liberation Mono"/>
           <w:sz w:val="17"/>
         </w:rPr>
-        <w:br/>
-        <w:t xml:space="preserve">  "confidence": 0.86,</w:t>
+        <w:t>"intent": "MOVE_PALLET",</w:t>
       </w:r>
       <w:r>
         <w:rPr>
@@ -2832,23 +2972,21 @@
           <w:sz w:val="17"/>
         </w:rPr>
         <w:br/>
-        <w:t xml:space="preserve">  "human_response_required": true,</w:t>
       </w:r>
       <w:r>
         <w:rPr>
           <w:rFonts w:ascii="Liberation Mono" w:hAnsi="Liberation Mono"/>
           <w:sz w:val="17"/>
         </w:rPr>
-        <w:br/>
-        <w:t xml:space="preserve">  "timeout_behavior": "WAIT",</w:t>
+        <w:lastRenderedPageBreak/>
+        <w:t xml:space="preserve"> </w:t>
       </w:r>
       <w:r>
         <w:rPr>
           <w:rFonts w:ascii="Liberation Mono" w:hAnsi="Liberation Mono"/>
           <w:sz w:val="17"/>
         </w:rPr>
-        <w:br/>
-        <w:t xml:space="preserve">  "fallback": "REPLAN",</w:t>
+        <w:t>"risk_tier": "R2",</w:t>
       </w:r>
       <w:r>
         <w:rPr>
@@ -2856,15 +2994,188 @@
           <w:sz w:val="17"/>
         </w:rPr>
         <w:br/>
-        <w:t xml:space="preserve">  "policy_hash": "...",</w:t>
       </w:r>
       <w:r>
         <w:rPr>
           <w:rFonts w:ascii="Liberation Mono" w:hAnsi="Liberation Mono"/>
           <w:sz w:val="17"/>
         </w:rPr>
+        <w:t xml:space="preserve"> </w:t>
+      </w:r>
+      <w:r>
+        <w:rPr>
+          <w:rFonts w:ascii="Liberation Mono" w:hAnsi="Liberation Mono"/>
+          <w:sz w:val="17"/>
+        </w:rPr>
+        <w:t>"affected_zone": {"type": "polygon", "frame": "map"},</w:t>
+      </w:r>
+      <w:r>
+        <w:rPr>
+          <w:rFonts w:ascii="Liberation Mono" w:hAnsi="Liberation Mono"/>
+          <w:sz w:val="17"/>
+        </w:rPr>
         <w:br/>
-        <w:t xml:space="preserve">  "signature": "..."</w:t>
+      </w:r>
+      <w:r>
+        <w:rPr>
+          <w:rFonts w:ascii="Liberation Mono" w:hAnsi="Liberation Mono"/>
+          <w:sz w:val="17"/>
+        </w:rPr>
+        <w:t xml:space="preserve"> </w:t>
+      </w:r>
+      <w:r>
+        <w:rPr>
+          <w:rFonts w:ascii="Liberation Mono" w:hAnsi="Liberation Mono"/>
+          <w:sz w:val="17"/>
+        </w:rPr>
+        <w:t>"start_after_ms": 1500,</w:t>
+      </w:r>
+      <w:r>
+        <w:rPr>
+          <w:rFonts w:ascii="Liberation Mono" w:hAnsi="Liberation Mono"/>
+          <w:sz w:val="17"/>
+        </w:rPr>
+        <w:br/>
+      </w:r>
+      <w:r>
+        <w:rPr>
+          <w:rFonts w:ascii="Liberation Mono" w:hAnsi="Liberation Mono"/>
+          <w:sz w:val="17"/>
+        </w:rPr>
+        <w:t xml:space="preserve"> </w:t>
+      </w:r>
+      <w:r>
+        <w:rPr>
+          <w:rFonts w:ascii="Liberation Mono" w:hAnsi="Liberation Mono"/>
+          <w:sz w:val="17"/>
+        </w:rPr>
+        <w:t>"expected_duration_ms": 6000,</w:t>
+      </w:r>
+      <w:r>
+        <w:rPr>
+          <w:rFonts w:ascii="Liberation Mono" w:hAnsi="Liberation Mono"/>
+          <w:sz w:val="17"/>
+        </w:rPr>
+        <w:br/>
+      </w:r>
+      <w:r>
+        <w:rPr>
+          <w:rFonts w:ascii="Liberation Mono" w:hAnsi="Liberation Mono"/>
+          <w:sz w:val="17"/>
+        </w:rPr>
+        <w:t xml:space="preserve"> </w:t>
+      </w:r>
+      <w:r>
+        <w:rPr>
+          <w:rFonts w:ascii="Liberation Mono" w:hAnsi="Liberation Mono"/>
+          <w:sz w:val="17"/>
+        </w:rPr>
+        <w:t>"confidence": 0.86,</w:t>
+      </w:r>
+      <w:r>
+        <w:rPr>
+          <w:rFonts w:ascii="Liberation Mono" w:hAnsi="Liberation Mono"/>
+          <w:sz w:val="17"/>
+        </w:rPr>
+        <w:br/>
+      </w:r>
+      <w:r>
+        <w:rPr>
+          <w:rFonts w:ascii="Liberation Mono" w:hAnsi="Liberation Mono"/>
+          <w:sz w:val="17"/>
+        </w:rPr>
+        <w:t xml:space="preserve"> </w:t>
+      </w:r>
+      <w:r>
+        <w:rPr>
+          <w:rFonts w:ascii="Liberation Mono" w:hAnsi="Liberation Mono"/>
+          <w:sz w:val="17"/>
+        </w:rPr>
+        <w:t>"human_response_required": true,</w:t>
+      </w:r>
+      <w:r>
+        <w:rPr>
+          <w:rFonts w:ascii="Liberation Mono" w:hAnsi="Liberation Mono"/>
+          <w:sz w:val="17"/>
+        </w:rPr>
+        <w:br/>
+      </w:r>
+      <w:r>
+        <w:rPr>
+          <w:rFonts w:ascii="Liberation Mono" w:hAnsi="Liberation Mono"/>
+          <w:sz w:val="17"/>
+        </w:rPr>
+        <w:t xml:space="preserve"> </w:t>
+      </w:r>
+      <w:r>
+        <w:rPr>
+          <w:rFonts w:ascii="Liberation Mono" w:hAnsi="Liberation Mono"/>
+          <w:sz w:val="17"/>
+        </w:rPr>
+        <w:t>"timeout_behavior": "WAIT",</w:t>
+      </w:r>
+      <w:r>
+        <w:rPr>
+          <w:rFonts w:ascii="Liberation Mono" w:hAnsi="Liberation Mono"/>
+          <w:sz w:val="17"/>
+        </w:rPr>
+        <w:br/>
+      </w:r>
+      <w:r>
+        <w:rPr>
+          <w:rFonts w:ascii="Liberation Mono" w:hAnsi="Liberation Mono"/>
+          <w:sz w:val="17"/>
+        </w:rPr>
+        <w:t xml:space="preserve"> </w:t>
+      </w:r>
+      <w:r>
+        <w:rPr>
+          <w:rFonts w:ascii="Liberation Mono" w:hAnsi="Liberation Mono"/>
+          <w:sz w:val="17"/>
+        </w:rPr>
+        <w:t>"fallback": "REPLAN",</w:t>
+      </w:r>
+      <w:r>
+        <w:rPr>
+          <w:rFonts w:ascii="Liberation Mono" w:hAnsi="Liberation Mono"/>
+          <w:sz w:val="17"/>
+        </w:rPr>
+        <w:br/>
+      </w:r>
+      <w:r>
+        <w:rPr>
+          <w:rFonts w:ascii="Liberation Mono" w:hAnsi="Liberation Mono"/>
+          <w:sz w:val="17"/>
+        </w:rPr>
+        <w:t xml:space="preserve"> </w:t>
+      </w:r>
+      <w:r>
+        <w:rPr>
+          <w:rFonts w:ascii="Liberation Mono" w:hAnsi="Liberation Mono"/>
+          <w:sz w:val="17"/>
+        </w:rPr>
+        <w:t>"policy_hash": "...",</w:t>
+      </w:r>
+      <w:r>
+        <w:rPr>
+          <w:rFonts w:ascii="Liberation Mono" w:hAnsi="Liberation Mono"/>
+          <w:sz w:val="17"/>
+        </w:rPr>
+        <w:br/>
+      </w:r>
+      <w:r>
+        <w:rPr>
+          <w:rFonts w:ascii="Liberation Mono" w:hAnsi="Liberation Mono"/>
+          <w:sz w:val="17"/>
+        </w:rPr>
+        <w:t xml:space="preserve"> </w:t>
+      </w:r>
+      <w:r>
+        <w:rPr>
+          <w:rFonts w:ascii="Liberation Mono" w:hAnsi="Liberation Mono"/>
+          <w:sz w:val="17"/>
+        </w:rPr>
+        <w:t>"signature": "..."</w:t>
       </w:r>
       <w:r>
         <w:rPr>
@@ -4260,21 +4571,21 @@
           <w:sz w:val="17"/>
         </w:rPr>
         <w:br/>
+        <w:t>├── configs/</w:t>
       </w:r>
       <w:r>
         <w:rPr>
           <w:rFonts w:ascii="Liberation Mono" w:hAnsi="Liberation Mono"/>
           <w:sz w:val="17"/>
         </w:rPr>
-        <w:t>├── configs/                 # experiment and risk-tier configuration</w:t>
+        <w:t xml:space="preserve">        </w:t>
       </w:r>
       <w:r>
         <w:rPr>
           <w:rFonts w:ascii="Liberation Mono" w:hAnsi="Liberation Mono"/>
           <w:sz w:val="17"/>
         </w:rPr>
-        <w:br/>
-        <w:t>├── environments/            # MuJoCo / Isaac Lab scenes</w:t>
+        <w:t xml:space="preserve"> # experiment and risk-tier configuration</w:t>
       </w:r>
       <w:r>
         <w:rPr>
@@ -4282,23 +4593,21 @@
           <w:sz w:val="17"/>
         </w:rPr>
         <w:br/>
-        <w:t>├── policies/                # worker/VLA/RL policy adapters</w:t>
+        <w:t>├── environments/</w:t>
       </w:r>
       <w:r>
         <w:rPr>
           <w:rFonts w:ascii="Liberation Mono" w:hAnsi="Liberation Mono"/>
           <w:sz w:val="17"/>
         </w:rPr>
-        <w:br/>
-        <w:t>├── supervisor/              # H2 semantic risk supervisor</w:t>
+        <w:t xml:space="preserve">      </w:t>
       </w:r>
       <w:r>
         <w:rPr>
           <w:rFonts w:ascii="Liberation Mono" w:hAnsi="Liberation Mono"/>
           <w:sz w:val="17"/>
         </w:rPr>
-        <w:br/>
-        <w:t>│   ├── policy.py</w:t>
+        <w:t># MuJoCo / Isaac Lab scenes</w:t>
       </w:r>
       <w:r>
         <w:rPr>
@@ -4306,23 +4615,21 @@
           <w:sz w:val="17"/>
         </w:rPr>
         <w:br/>
-        <w:t>│   ├── risk_model.py</w:t>
+        <w:t>├── policies/</w:t>
       </w:r>
       <w:r>
         <w:rPr>
           <w:rFonts w:ascii="Liberation Mono" w:hAnsi="Liberation Mono"/>
           <w:sz w:val="17"/>
         </w:rPr>
-        <w:br/>
-        <w:t>│   └── model_adapters.py</w:t>
+        <w:t xml:space="preserve">        </w:t>
       </w:r>
       <w:r>
         <w:rPr>
           <w:rFonts w:ascii="Liberation Mono" w:hAnsi="Liberation Mono"/>
           <w:sz w:val="17"/>
         </w:rPr>
-        <w:br/>
-        <w:t>├── hrcp/                    # H3 protocol + human-interface adapters</w:t>
+        <w:t># worker/VLA/RL policy adapters</w:t>
       </w:r>
       <w:r>
         <w:rPr>
@@ -4330,23 +4637,21 @@
           <w:sz w:val="17"/>
         </w:rPr>
         <w:br/>
-        <w:t>│   ├── schema.json</w:t>
+        <w:t>├── supervisor/</w:t>
       </w:r>
       <w:r>
         <w:rPr>
           <w:rFonts w:ascii="Liberation Mono" w:hAnsi="Liberation Mono"/>
           <w:sz w:val="17"/>
         </w:rPr>
-        <w:br/>
-        <w:t>│   ├── state_machine.py</w:t>
+        <w:t xml:space="preserve">       </w:t>
       </w:r>
       <w:r>
         <w:rPr>
           <w:rFonts w:ascii="Liberation Mono" w:hAnsi="Liberation Mono"/>
           <w:sz w:val="17"/>
         </w:rPr>
-        <w:br/>
-        <w:t>│   └── transport.py</w:t>
+        <w:t># H2 semantic risk supervisor</w:t>
       </w:r>
       <w:r>
         <w:rPr>
@@ -4354,21 +4659,21 @@
           <w:sz w:val="17"/>
         </w:rPr>
         <w:br/>
-        <w:t>├── safety/</w:t>
+        <w:t>│</w:t>
       </w:r>
       <w:r>
         <w:rPr>
           <w:rFonts w:ascii="Liberation Mono" w:hAnsi="Liberation Mono"/>
           <w:sz w:val="17"/>
         </w:rPr>
-        <w:br/>
+        <w:t xml:space="preserve"> </w:t>
       </w:r>
       <w:r>
         <w:rPr>
           <w:rFonts w:ascii="Liberation Mono" w:hAnsi="Liberation Mono"/>
           <w:sz w:val="17"/>
         </w:rPr>
-        <w:t>│   ├── mpc.py               # H1 predictive safety filter</w:t>
+        <w:t xml:space="preserve"> ├── policy.py</w:t>
       </w:r>
       <w:r>
         <w:rPr>
@@ -4376,21 +4681,239 @@
           <w:sz w:val="17"/>
         </w:rPr>
         <w:br/>
-        <w:t>│   ├── cbf.py</w:t>
+        <w:t>│</w:t>
       </w:r>
       <w:r>
         <w:rPr>
           <w:rFonts w:ascii="Liberation Mono" w:hAnsi="Liberation Mono"/>
           <w:sz w:val="17"/>
         </w:rPr>
-        <w:br/>
-        <w:t>│   └── hard_safety_stub.py  # simulation representation only</w:t>
+        <w:t xml:space="preserve"> </w:t>
       </w:r>
       <w:r>
         <w:rPr>
           <w:rFonts w:ascii="Liberation Mono" w:hAnsi="Liberation Mono"/>
           <w:sz w:val="17"/>
         </w:rPr>
+        <w:t xml:space="preserve"> ├── risk_model.py</w:t>
+      </w:r>
+      <w:r>
+        <w:rPr>
+          <w:rFonts w:ascii="Liberation Mono" w:hAnsi="Liberation Mono"/>
+          <w:sz w:val="17"/>
+        </w:rPr>
+        <w:br/>
+        <w:t>│</w:t>
+      </w:r>
+      <w:r>
+        <w:rPr>
+          <w:rFonts w:ascii="Liberation Mono" w:hAnsi="Liberation Mono"/>
+          <w:sz w:val="17"/>
+        </w:rPr>
+        <w:t xml:space="preserve"> </w:t>
+      </w:r>
+      <w:r>
+        <w:rPr>
+          <w:rFonts w:ascii="Liberation Mono" w:hAnsi="Liberation Mono"/>
+          <w:sz w:val="17"/>
+        </w:rPr>
+        <w:t xml:space="preserve"> └── model_adapters.py</w:t>
+      </w:r>
+      <w:r>
+        <w:rPr>
+          <w:rFonts w:ascii="Liberation Mono" w:hAnsi="Liberation Mono"/>
+          <w:sz w:val="17"/>
+        </w:rPr>
+        <w:br/>
+        <w:t>├── hrcp/</w:t>
+      </w:r>
+      <w:r>
+        <w:rPr>
+          <w:rFonts w:ascii="Liberation Mono" w:hAnsi="Liberation Mono"/>
+          <w:sz w:val="17"/>
+        </w:rPr>
+        <w:t xml:space="preserve">          </w:t>
+      </w:r>
+      <w:r>
+        <w:rPr>
+          <w:rFonts w:ascii="Liberation Mono" w:hAnsi="Liberation Mono"/>
+          <w:sz w:val="17"/>
+        </w:rPr>
+        <w:t># H3 protocol + human-interface adapters</w:t>
+      </w:r>
+      <w:r>
+        <w:rPr>
+          <w:rFonts w:ascii="Liberation Mono" w:hAnsi="Liberation Mono"/>
+          <w:sz w:val="17"/>
+        </w:rPr>
+        <w:br/>
+        <w:t>│</w:t>
+      </w:r>
+      <w:r>
+        <w:rPr>
+          <w:rFonts w:ascii="Liberation Mono" w:hAnsi="Liberation Mono"/>
+          <w:sz w:val="17"/>
+        </w:rPr>
+        <w:t xml:space="preserve"> </w:t>
+      </w:r>
+      <w:r>
+        <w:rPr>
+          <w:rFonts w:ascii="Liberation Mono" w:hAnsi="Liberation Mono"/>
+          <w:sz w:val="17"/>
+        </w:rPr>
+        <w:t xml:space="preserve"> ├── schema.json</w:t>
+      </w:r>
+      <w:r>
+        <w:rPr>
+          <w:rFonts w:ascii="Liberation Mono" w:hAnsi="Liberation Mono"/>
+          <w:sz w:val="17"/>
+        </w:rPr>
+        <w:br/>
+        <w:t>│</w:t>
+      </w:r>
+      <w:r>
+        <w:rPr>
+          <w:rFonts w:ascii="Liberation Mono" w:hAnsi="Liberation Mono"/>
+          <w:sz w:val="17"/>
+        </w:rPr>
+        <w:t xml:space="preserve"> </w:t>
+      </w:r>
+      <w:r>
+        <w:rPr>
+          <w:rFonts w:ascii="Liberation Mono" w:hAnsi="Liberation Mono"/>
+          <w:sz w:val="17"/>
+        </w:rPr>
+        <w:t xml:space="preserve"> ├── state_machine.py</w:t>
+      </w:r>
+      <w:r>
+        <w:rPr>
+          <w:rFonts w:ascii="Liberation Mono" w:hAnsi="Liberation Mono"/>
+          <w:sz w:val="17"/>
+        </w:rPr>
+        <w:br/>
+        <w:t>│</w:t>
+      </w:r>
+      <w:r>
+        <w:rPr>
+          <w:rFonts w:ascii="Liberation Mono" w:hAnsi="Liberation Mono"/>
+          <w:sz w:val="17"/>
+        </w:rPr>
+        <w:t xml:space="preserve"> </w:t>
+      </w:r>
+      <w:r>
+        <w:rPr>
+          <w:rFonts w:ascii="Liberation Mono" w:hAnsi="Liberation Mono"/>
+          <w:sz w:val="17"/>
+        </w:rPr>
+        <w:t xml:space="preserve"> └── transport.py</w:t>
+      </w:r>
+      <w:r>
+        <w:rPr>
+          <w:rFonts w:ascii="Liberation Mono" w:hAnsi="Liberation Mono"/>
+          <w:sz w:val="17"/>
+        </w:rPr>
+        <w:br/>
+        <w:t>├── safety/</w:t>
+      </w:r>
+      <w:r>
+        <w:rPr>
+          <w:rFonts w:ascii="Liberation Mono" w:hAnsi="Liberation Mono"/>
+          <w:sz w:val="17"/>
+        </w:rPr>
+        <w:br/>
+        <w:t>│</w:t>
+      </w:r>
+      <w:r>
+        <w:rPr>
+          <w:rFonts w:ascii="Liberation Mono" w:hAnsi="Liberation Mono"/>
+          <w:sz w:val="17"/>
+        </w:rPr>
+        <w:t xml:space="preserve"> </w:t>
+      </w:r>
+      <w:r>
+        <w:rPr>
+          <w:rFonts w:ascii="Liberation Mono" w:hAnsi="Liberation Mono"/>
+          <w:sz w:val="17"/>
+        </w:rPr>
+        <w:t xml:space="preserve"> ├── mpc.py</w:t>
+      </w:r>
+      <w:r>
+        <w:rPr>
+          <w:rFonts w:ascii="Liberation Mono" w:hAnsi="Liberation Mono"/>
+          <w:sz w:val="17"/>
+        </w:rPr>
+        <w:t xml:space="preserve">       </w:t>
+      </w:r>
+      <w:r>
+        <w:rPr>
+          <w:rFonts w:ascii="Liberation Mono" w:hAnsi="Liberation Mono"/>
+          <w:sz w:val="17"/>
+        </w:rPr>
+        <w:t xml:space="preserve"> # H1 predictive safety filter</w:t>
+      </w:r>
+      <w:r>
+        <w:rPr>
+          <w:rFonts w:ascii="Liberation Mono" w:hAnsi="Liberation Mono"/>
+          <w:sz w:val="17"/>
+        </w:rPr>
+        <w:br/>
+        <w:t>│</w:t>
+      </w:r>
+      <w:r>
+        <w:rPr>
+          <w:rFonts w:ascii="Liberation Mono" w:hAnsi="Liberation Mono"/>
+          <w:sz w:val="17"/>
+        </w:rPr>
+        <w:t xml:space="preserve"> </w:t>
+      </w:r>
+      <w:r>
+        <w:rPr>
+          <w:rFonts w:ascii="Liberation Mono" w:hAnsi="Liberation Mono"/>
+          <w:sz w:val="17"/>
+        </w:rPr>
+        <w:t xml:space="preserve"> ├── cbf.py</w:t>
+      </w:r>
+      <w:r>
+        <w:rPr>
+          <w:rFonts w:ascii="Liberation Mono" w:hAnsi="Liberation Mono"/>
+          <w:sz w:val="17"/>
+        </w:rPr>
+        <w:br/>
+        <w:t>│</w:t>
+      </w:r>
+      <w:r>
+        <w:rPr>
+          <w:rFonts w:ascii="Liberation Mono" w:hAnsi="Liberation Mono"/>
+          <w:sz w:val="17"/>
+        </w:rPr>
+        <w:t xml:space="preserve"> </w:t>
+      </w:r>
+      <w:r>
+        <w:rPr>
+          <w:rFonts w:ascii="Liberation Mono" w:hAnsi="Liberation Mono"/>
+          <w:sz w:val="17"/>
+        </w:rPr>
+        <w:t xml:space="preserve"> └── hard_safety_stub.py</w:t>
+      </w:r>
+      <w:r>
+        <w:rPr>
+          <w:rFonts w:ascii="Liberation Mono" w:hAnsi="Liberation Mono"/>
+          <w:sz w:val="17"/>
+        </w:rPr>
+        <w:t xml:space="preserve"> </w:t>
+      </w:r>
+      <w:r>
+        <w:rPr>
+          <w:rFonts w:ascii="Liberation Mono" w:hAnsi="Liberation Mono"/>
+          <w:sz w:val="17"/>
+        </w:rPr>
+        <w:t># simulation representation only</w:t>
+      </w:r>
+      <w:r>
+        <w:rPr>
+          <w:rFonts w:ascii="Liberation Mono" w:hAnsi="Liberation Mono"/>
+          <w:sz w:val="17"/>
+        </w:rPr>
         <w:br/>
         <w:t>├── scenarios/</w:t>
       </w:r>
@@ -4400,23 +4923,21 @@
           <w:sz w:val="17"/>
         </w:rPr>
         <w:br/>
-        <w:t>│   ├── nominal/</w:t>
+        <w:t>│</w:t>
       </w:r>
       <w:r>
         <w:rPr>
           <w:rFonts w:ascii="Liberation Mono" w:hAnsi="Liberation Mono"/>
           <w:sz w:val="17"/>
         </w:rPr>
-        <w:br/>
-        <w:t>│   ├── crowd/</w:t>
+        <w:t xml:space="preserve"> </w:t>
       </w:r>
       <w:r>
         <w:rPr>
           <w:rFonts w:ascii="Liberation Mono" w:hAnsi="Liberation Mono"/>
           <w:sz w:val="17"/>
         </w:rPr>
-        <w:br/>
-        <w:t>│   ├── livestock/</w:t>
+        <w:t xml:space="preserve"> ├── nominal/</w:t>
       </w:r>
       <w:r>
         <w:rPr>
@@ -4424,23 +4945,21 @@
           <w:sz w:val="17"/>
         </w:rPr>
         <w:br/>
-        <w:t>│   ├── faults/</w:t>
+        <w:t>│</w:t>
       </w:r>
       <w:r>
         <w:rPr>
           <w:rFonts w:ascii="Liberation Mono" w:hAnsi="Liberation Mono"/>
           <w:sz w:val="17"/>
         </w:rPr>
-        <w:br/>
-        <w:t>│   ├── adversarial/</w:t>
+        <w:t xml:space="preserve"> </w:t>
       </w:r>
       <w:r>
         <w:rPr>
           <w:rFonts w:ascii="Liberation Mono" w:hAnsi="Liberation Mono"/>
           <w:sz w:val="17"/>
         </w:rPr>
-        <w:br/>
-        <w:t>│   └── incident_replay/</w:t>
+        <w:t xml:space="preserve"> ├── crowd/</w:t>
       </w:r>
       <w:r>
         <w:rPr>
@@ -4448,23 +4967,21 @@
           <w:sz w:val="17"/>
         </w:rPr>
         <w:br/>
-        <w:t>├── attacks/                 # prompt/goal, sensor, identity and latency faults</w:t>
+        <w:t>│</w:t>
       </w:r>
       <w:r>
         <w:rPr>
           <w:rFonts w:ascii="Liberation Mono" w:hAnsi="Liberation Mono"/>
           <w:sz w:val="17"/>
         </w:rPr>
-        <w:br/>
-        <w:t>├── metrics/                 # safety, task, latency, human coordination</w:t>
+        <w:t xml:space="preserve"> </w:t>
       </w:r>
       <w:r>
         <w:rPr>
           <w:rFonts w:ascii="Liberation Mono" w:hAnsi="Liberation Mono"/>
           <w:sz w:val="17"/>
         </w:rPr>
-        <w:br/>
-        <w:t>├── experiments/             # factorial runner + seeds</w:t>
+        <w:t xml:space="preserve"> ├── livestock/</w:t>
       </w:r>
       <w:r>
         <w:rPr>
@@ -4472,21 +4989,175 @@
           <w:sz w:val="17"/>
         </w:rPr>
         <w:br/>
+        <w:t>│</w:t>
       </w:r>
       <w:r>
         <w:rPr>
           <w:rFonts w:ascii="Liberation Mono" w:hAnsi="Liberation Mono"/>
           <w:sz w:val="17"/>
         </w:rPr>
-        <w:t>├── analysis/                # statistics and plots</w:t>
+        <w:t xml:space="preserve"> </w:t>
       </w:r>
       <w:r>
         <w:rPr>
           <w:rFonts w:ascii="Liberation Mono" w:hAnsi="Liberation Mono"/>
           <w:sz w:val="17"/>
         </w:rPr>
+        <w:t xml:space="preserve"> ├── faults/</w:t>
+      </w:r>
+      <w:r>
+        <w:rPr>
+          <w:rFonts w:ascii="Liberation Mono" w:hAnsi="Liberation Mono"/>
+          <w:sz w:val="17"/>
+        </w:rPr>
         <w:br/>
-        <w:t>└── tests/                   # unit, property and scenario tests</w:t>
+        <w:t>│</w:t>
+      </w:r>
+      <w:r>
+        <w:rPr>
+          <w:rFonts w:ascii="Liberation Mono" w:hAnsi="Liberation Mono"/>
+          <w:sz w:val="17"/>
+        </w:rPr>
+        <w:t xml:space="preserve"> </w:t>
+      </w:r>
+      <w:r>
+        <w:rPr>
+          <w:rFonts w:ascii="Liberation Mono" w:hAnsi="Liberation Mono"/>
+          <w:sz w:val="17"/>
+        </w:rPr>
+        <w:t xml:space="preserve"> ├── adversarial/</w:t>
+      </w:r>
+      <w:r>
+        <w:rPr>
+          <w:rFonts w:ascii="Liberation Mono" w:hAnsi="Liberation Mono"/>
+          <w:sz w:val="17"/>
+        </w:rPr>
+        <w:br/>
+        <w:t>│</w:t>
+      </w:r>
+      <w:r>
+        <w:rPr>
+          <w:rFonts w:ascii="Liberation Mono" w:hAnsi="Liberation Mono"/>
+          <w:sz w:val="17"/>
+        </w:rPr>
+        <w:t xml:space="preserve"> </w:t>
+      </w:r>
+      <w:r>
+        <w:rPr>
+          <w:rFonts w:ascii="Liberation Mono" w:hAnsi="Liberation Mono"/>
+          <w:sz w:val="17"/>
+        </w:rPr>
+        <w:t xml:space="preserve"> └── incident_replay/</w:t>
+      </w:r>
+      <w:r>
+        <w:rPr>
+          <w:rFonts w:ascii="Liberation Mono" w:hAnsi="Liberation Mono"/>
+          <w:sz w:val="17"/>
+        </w:rPr>
+        <w:br/>
+        <w:t>├── attacks/</w:t>
+      </w:r>
+      <w:r>
+        <w:rPr>
+          <w:rFonts w:ascii="Liberation Mono" w:hAnsi="Liberation Mono"/>
+          <w:sz w:val="17"/>
+        </w:rPr>
+        <w:t xml:space="preserve">        </w:t>
+      </w:r>
+      <w:r>
+        <w:rPr>
+          <w:rFonts w:ascii="Liberation Mono" w:hAnsi="Liberation Mono"/>
+          <w:sz w:val="17"/>
+        </w:rPr>
+        <w:t xml:space="preserve"> # prompt/goal, sensor, identity and latency faults</w:t>
+      </w:r>
+      <w:r>
+        <w:rPr>
+          <w:rFonts w:ascii="Liberation Mono" w:hAnsi="Liberation Mono"/>
+          <w:sz w:val="17"/>
+        </w:rPr>
+        <w:br/>
+        <w:t>├── metrics/</w:t>
+      </w:r>
+      <w:r>
+        <w:rPr>
+          <w:rFonts w:ascii="Liberation Mono" w:hAnsi="Liberation Mono"/>
+          <w:sz w:val="17"/>
+        </w:rPr>
+        <w:t xml:space="preserve">        </w:t>
+      </w:r>
+      <w:r>
+        <w:rPr>
+          <w:rFonts w:ascii="Liberation Mono" w:hAnsi="Liberation Mono"/>
+          <w:sz w:val="17"/>
+        </w:rPr>
+        <w:t xml:space="preserve"> # safety, task, latency, human coordination</w:t>
+      </w:r>
+      <w:r>
+        <w:rPr>
+          <w:rFonts w:ascii="Liberation Mono" w:hAnsi="Liberation Mono"/>
+          <w:sz w:val="17"/>
+        </w:rPr>
+        <w:br/>
+        <w:t>├── experiments/</w:t>
+      </w:r>
+      <w:r>
+        <w:rPr>
+          <w:rFonts w:ascii="Liberation Mono" w:hAnsi="Liberation Mono"/>
+          <w:sz w:val="17"/>
+        </w:rPr>
+        <w:t xml:space="preserve">      </w:t>
+      </w:r>
+      <w:r>
+        <w:rPr>
+          <w:rFonts w:ascii="Liberation Mono" w:hAnsi="Liberation Mono"/>
+          <w:sz w:val="17"/>
+        </w:rPr>
+        <w:t xml:space="preserve"> # factorial runner + seeds</w:t>
+      </w:r>
+      <w:r>
+        <w:rPr>
+          <w:rFonts w:ascii="Liberation Mono" w:hAnsi="Liberation Mono"/>
+          <w:sz w:val="17"/>
+        </w:rPr>
+        <w:br/>
+        <w:t>├── analysis/</w:t>
+      </w:r>
+      <w:r>
+        <w:rPr>
+          <w:rFonts w:ascii="Liberation Mono" w:hAnsi="Liberation Mono"/>
+          <w:sz w:val="17"/>
+        </w:rPr>
+        <w:t xml:space="preserve">        </w:t>
+      </w:r>
+      <w:r>
+        <w:rPr>
+          <w:rFonts w:ascii="Liberation Mono" w:hAnsi="Liberation Mono"/>
+          <w:sz w:val="17"/>
+        </w:rPr>
+        <w:t># statistics and plots</w:t>
+      </w:r>
+      <w:r>
+        <w:rPr>
+          <w:rFonts w:ascii="Liberation Mono" w:hAnsi="Liberation Mono"/>
+          <w:sz w:val="17"/>
+        </w:rPr>
+        <w:br/>
+        <w:t>└── tests/</w:t>
+      </w:r>
+      <w:r>
+        <w:rPr>
+          <w:rFonts w:ascii="Liberation Mono" w:hAnsi="Liberation Mono"/>
+          <w:sz w:val="17"/>
+        </w:rPr>
+        <w:t xml:space="preserve">         </w:t>
+      </w:r>
+      <w:r>
+        <w:rPr>
+          <w:rFonts w:ascii="Liberation Mono" w:hAnsi="Liberation Mono"/>
+          <w:sz w:val="17"/>
+        </w:rPr>
+        <w:t xml:space="preserve"> # unit, property and scenario tests</w:t>
       </w:r>
     </w:p>
     <w:p>
@@ -4518,22 +5189,20 @@
           <w:sz w:val="17"/>
         </w:rPr>
         <w:br/>
-        <w:t xml:space="preserve">    obs = sensors.observe()</w:t>
       </w:r>
       <w:r>
         <w:rPr>
           <w:rFonts w:ascii="Liberation Mono" w:hAnsi="Liberation Mono"/>
           <w:sz w:val="17"/>
         </w:rPr>
-        <w:br/>
-        <w:t xml:space="preserve">    proposal = worker.propose(obs, mission)</w:t>
+        <w:t xml:space="preserve">  </w:t>
       </w:r>
       <w:r>
         <w:rPr>
           <w:rFonts w:ascii="Liberation Mono" w:hAnsi="Liberation Mono"/>
           <w:sz w:val="17"/>
         </w:rPr>
-        <w:br/>
+        <w:t>obs = sensors.observe()</w:t>
       </w:r>
       <w:r>
         <w:rPr>
@@ -4541,23 +5210,20 @@
           <w:sz w:val="17"/>
         </w:rPr>
         <w:br/>
-        <w:t xml:space="preserve">    if supervisor.enabled:</w:t>
       </w:r>
       <w:r>
         <w:rPr>
           <w:rFonts w:ascii="Liberation Mono" w:hAnsi="Liberation Mono"/>
           <w:sz w:val="17"/>
         </w:rPr>
-        <w:br/>
-        <w:t xml:space="preserve">        review = supervisor.assess(obs, proposal, risk_policy)</w:t>
+        <w:t xml:space="preserve">  </w:t>
       </w:r>
       <w:r>
         <w:rPr>
           <w:rFonts w:ascii="Liberation Mono" w:hAnsi="Liberation Mono"/>
           <w:sz w:val="17"/>
         </w:rPr>
-        <w:br/>
-        <w:t xml:space="preserve">        if review.decision == "STOP":</w:t>
+        <w:t>proposal = worker.propose(obs, mission)</w:t>
       </w:r>
       <w:r>
         <w:rPr>
@@ -4565,7 +5231,6 @@
           <w:sz w:val="17"/>
         </w:rPr>
         <w:br/>
-        <w:t xml:space="preserve">            return safe_state("supervisor_veto")</w:t>
       </w:r>
       <w:r>
         <w:rPr>
@@ -4579,15 +5244,14 @@
           <w:rFonts w:ascii="Liberation Mono" w:hAnsi="Liberation Mono"/>
           <w:sz w:val="17"/>
         </w:rPr>
-        <w:lastRenderedPageBreak/>
-        <w:t xml:space="preserve">        proposal = review.modified_action or proposal</w:t>
+        <w:t xml:space="preserve">  </w:t>
       </w:r>
       <w:r>
         <w:rPr>
           <w:rFonts w:ascii="Liberation Mono" w:hAnsi="Liberation Mono"/>
           <w:sz w:val="17"/>
         </w:rPr>
-        <w:br/>
+        <w:t>if supervisor.enabled:</w:t>
       </w:r>
       <w:r>
         <w:rPr>
@@ -4601,15 +5265,14 @@
           <w:rFonts w:ascii="Liberation Mono" w:hAnsi="Liberation Mono"/>
           <w:sz w:val="17"/>
         </w:rPr>
-        <w:t xml:space="preserve">    if hrcp.enabled and review.requires_human_coordination:</w:t>
+        <w:t xml:space="preserve">    </w:t>
       </w:r>
       <w:r>
         <w:rPr>
           <w:rFonts w:ascii="Liberation Mono" w:hAnsi="Liberation Mono"/>
           <w:sz w:val="17"/>
         </w:rPr>
-        <w:br/>
-        <w:t xml:space="preserve">        response = hrcp.negotiate(proposal, review.risk_tier)</w:t>
+        <w:t>review = supervisor.assess(obs, proposal, risk_policy)</w:t>
       </w:r>
       <w:r>
         <w:rPr>
@@ -4617,22 +5280,20 @@
           <w:sz w:val="17"/>
         </w:rPr>
         <w:br/>
-        <w:t xml:space="preserve">        if response in {"DENY", "TIMEOUT"}:</w:t>
       </w:r>
       <w:r>
         <w:rPr>
           <w:rFonts w:ascii="Liberation Mono" w:hAnsi="Liberation Mono"/>
           <w:sz w:val="17"/>
         </w:rPr>
-        <w:br/>
-        <w:t xml:space="preserve">            proposal = worker.replan(obs, constraint="WAIT_OR_ALTERNATIVE")</w:t>
+        <w:t xml:space="preserve">    </w:t>
       </w:r>
       <w:r>
         <w:rPr>
           <w:rFonts w:ascii="Liberation Mono" w:hAnsi="Liberation Mono"/>
           <w:sz w:val="17"/>
         </w:rPr>
-        <w:br/>
+        <w:t>if review.decision == "STOP":</w:t>
       </w:r>
       <w:r>
         <w:rPr>
@@ -4640,22 +5301,20 @@
           <w:sz w:val="17"/>
         </w:rPr>
         <w:br/>
-        <w:t xml:space="preserve">    control = policy_to_control(proposal, obs)</w:t>
       </w:r>
       <w:r>
         <w:rPr>
           <w:rFonts w:ascii="Liberation Mono" w:hAnsi="Liberation Mono"/>
           <w:sz w:val="17"/>
         </w:rPr>
-        <w:br/>
+        <w:t xml:space="preserve">      </w:t>
       </w:r>
       <w:r>
         <w:rPr>
           <w:rFonts w:ascii="Liberation Mono" w:hAnsi="Liberation Mono"/>
           <w:sz w:val="17"/>
         </w:rPr>
-        <w:br/>
-        <w:t xml:space="preserve">    if mpc_filter.enabled:</w:t>
+        <w:t>return safe_state("supervisor_veto")</w:t>
       </w:r>
       <w:r>
         <w:rPr>
@@ -4663,22 +5322,21 @@
           <w:sz w:val="17"/>
         </w:rPr>
         <w:br/>
-        <w:t xml:space="preserve">        control = mpc_filter.project_to_safe_set(control, obs)</w:t>
       </w:r>
       <w:r>
         <w:rPr>
           <w:rFonts w:ascii="Liberation Mono" w:hAnsi="Liberation Mono"/>
           <w:sz w:val="17"/>
         </w:rPr>
-        <w:br/>
+        <w:lastRenderedPageBreak/>
+        <w:t xml:space="preserve">    </w:t>
       </w:r>
       <w:r>
         <w:rPr>
           <w:rFonts w:ascii="Liberation Mono" w:hAnsi="Liberation Mono"/>
           <w:sz w:val="17"/>
         </w:rPr>
-        <w:br/>
-        <w:t xml:space="preserve">    # Independent safety kernel has final authority.</w:t>
+        <w:t>proposal = review.modified_action or proposal</w:t>
       </w:r>
       <w:r>
         <w:rPr>
@@ -4686,7 +5344,6 @@
           <w:sz w:val="17"/>
         </w:rPr>
         <w:br/>
-        <w:t xml:space="preserve">    control = safety_kernel.enforce(control, obs)</w:t>
       </w:r>
       <w:r>
         <w:rPr>
@@ -4700,15 +5357,245 @@
           <w:rFonts w:ascii="Liberation Mono" w:hAnsi="Liberation Mono"/>
           <w:sz w:val="17"/>
         </w:rPr>
-        <w:t xml:space="preserve">    actuators.execute(control)</w:t>
+        <w:t xml:space="preserve">  </w:t>
       </w:r>
       <w:r>
         <w:rPr>
           <w:rFonts w:ascii="Liberation Mono" w:hAnsi="Liberation Mono"/>
           <w:sz w:val="17"/>
         </w:rPr>
+        <w:t>if hrcp.enabled and review.requires_human_coordination:</w:t>
+      </w:r>
+      <w:r>
+        <w:rPr>
+          <w:rFonts w:ascii="Liberation Mono" w:hAnsi="Liberation Mono"/>
+          <w:sz w:val="17"/>
+        </w:rPr>
         <w:br/>
-        <w:t xml:space="preserve">    logger.record(obs, proposal, control, review, response)</w:t>
+      </w:r>
+      <w:r>
+        <w:rPr>
+          <w:rFonts w:ascii="Liberation Mono" w:hAnsi="Liberation Mono"/>
+          <w:sz w:val="17"/>
+        </w:rPr>
+        <w:t xml:space="preserve">    </w:t>
+      </w:r>
+      <w:r>
+        <w:rPr>
+          <w:rFonts w:ascii="Liberation Mono" w:hAnsi="Liberation Mono"/>
+          <w:sz w:val="17"/>
+        </w:rPr>
+        <w:t>response = hrcp.negotiate(proposal, review.risk_tier)</w:t>
+      </w:r>
+      <w:r>
+        <w:rPr>
+          <w:rFonts w:ascii="Liberation Mono" w:hAnsi="Liberation Mono"/>
+          <w:sz w:val="17"/>
+        </w:rPr>
+        <w:br/>
+      </w:r>
+      <w:r>
+        <w:rPr>
+          <w:rFonts w:ascii="Liberation Mono" w:hAnsi="Liberation Mono"/>
+          <w:sz w:val="17"/>
+        </w:rPr>
+        <w:t xml:space="preserve">    </w:t>
+      </w:r>
+      <w:r>
+        <w:rPr>
+          <w:rFonts w:ascii="Liberation Mono" w:hAnsi="Liberation Mono"/>
+          <w:sz w:val="17"/>
+        </w:rPr>
+        <w:t>if response in {"DENY", "TIMEOUT"}:</w:t>
+      </w:r>
+      <w:r>
+        <w:rPr>
+          <w:rFonts w:ascii="Liberation Mono" w:hAnsi="Liberation Mono"/>
+          <w:sz w:val="17"/>
+        </w:rPr>
+        <w:br/>
+      </w:r>
+      <w:r>
+        <w:rPr>
+          <w:rFonts w:ascii="Liberation Mono" w:hAnsi="Liberation Mono"/>
+          <w:sz w:val="17"/>
+        </w:rPr>
+        <w:t xml:space="preserve">      </w:t>
+      </w:r>
+      <w:r>
+        <w:rPr>
+          <w:rFonts w:ascii="Liberation Mono" w:hAnsi="Liberation Mono"/>
+          <w:sz w:val="17"/>
+        </w:rPr>
+        <w:t>proposal = worker.replan(obs, constraint="WAIT_OR_ALTERNATIVE")</w:t>
+      </w:r>
+      <w:r>
+        <w:rPr>
+          <w:rFonts w:ascii="Liberation Mono" w:hAnsi="Liberation Mono"/>
+          <w:sz w:val="17"/>
+        </w:rPr>
+        <w:br/>
+      </w:r>
+      <w:r>
+        <w:rPr>
+          <w:rFonts w:ascii="Liberation Mono" w:hAnsi="Liberation Mono"/>
+          <w:sz w:val="17"/>
+        </w:rPr>
+        <w:br/>
+      </w:r>
+      <w:r>
+        <w:rPr>
+          <w:rFonts w:ascii="Liberation Mono" w:hAnsi="Liberation Mono"/>
+          <w:sz w:val="17"/>
+        </w:rPr>
+        <w:t xml:space="preserve">  </w:t>
+      </w:r>
+      <w:r>
+        <w:rPr>
+          <w:rFonts w:ascii="Liberation Mono" w:hAnsi="Liberation Mono"/>
+          <w:sz w:val="17"/>
+        </w:rPr>
+        <w:t>control = policy_to_control(proposal, obs)</w:t>
+      </w:r>
+      <w:r>
+        <w:rPr>
+          <w:rFonts w:ascii="Liberation Mono" w:hAnsi="Liberation Mono"/>
+          <w:sz w:val="17"/>
+        </w:rPr>
+        <w:br/>
+      </w:r>
+      <w:r>
+        <w:rPr>
+          <w:rFonts w:ascii="Liberation Mono" w:hAnsi="Liberation Mono"/>
+          <w:sz w:val="17"/>
+        </w:rPr>
+        <w:br/>
+      </w:r>
+      <w:r>
+        <w:rPr>
+          <w:rFonts w:ascii="Liberation Mono" w:hAnsi="Liberation Mono"/>
+          <w:sz w:val="17"/>
+        </w:rPr>
+        <w:t xml:space="preserve">  </w:t>
+      </w:r>
+      <w:r>
+        <w:rPr>
+          <w:rFonts w:ascii="Liberation Mono" w:hAnsi="Liberation Mono"/>
+          <w:sz w:val="17"/>
+        </w:rPr>
+        <w:t>if mpc_filter.enabled:</w:t>
+      </w:r>
+      <w:r>
+        <w:rPr>
+          <w:rFonts w:ascii="Liberation Mono" w:hAnsi="Liberation Mono"/>
+          <w:sz w:val="17"/>
+        </w:rPr>
+        <w:br/>
+      </w:r>
+      <w:r>
+        <w:rPr>
+          <w:rFonts w:ascii="Liberation Mono" w:hAnsi="Liberation Mono"/>
+          <w:sz w:val="17"/>
+        </w:rPr>
+        <w:t xml:space="preserve">    </w:t>
+      </w:r>
+      <w:r>
+        <w:rPr>
+          <w:rFonts w:ascii="Liberation Mono" w:hAnsi="Liberation Mono"/>
+          <w:sz w:val="17"/>
+        </w:rPr>
+        <w:t>control = mpc_filter.project_to_safe_set(control, obs)</w:t>
+      </w:r>
+      <w:r>
+        <w:rPr>
+          <w:rFonts w:ascii="Liberation Mono" w:hAnsi="Liberation Mono"/>
+          <w:sz w:val="17"/>
+        </w:rPr>
+        <w:br/>
+      </w:r>
+      <w:r>
+        <w:rPr>
+          <w:rFonts w:ascii="Liberation Mono" w:hAnsi="Liberation Mono"/>
+          <w:sz w:val="17"/>
+        </w:rPr>
+        <w:br/>
+      </w:r>
+      <w:r>
+        <w:rPr>
+          <w:rFonts w:ascii="Liberation Mono" w:hAnsi="Liberation Mono"/>
+          <w:sz w:val="17"/>
+        </w:rPr>
+        <w:t xml:space="preserve">  </w:t>
+      </w:r>
+      <w:r>
+        <w:rPr>
+          <w:rFonts w:ascii="Liberation Mono" w:hAnsi="Liberation Mono"/>
+          <w:sz w:val="17"/>
+        </w:rPr>
+        <w:t># Independent safety kernel has final authority.</w:t>
+      </w:r>
+      <w:r>
+        <w:rPr>
+          <w:rFonts w:ascii="Liberation Mono" w:hAnsi="Liberation Mono"/>
+          <w:sz w:val="17"/>
+        </w:rPr>
+        <w:br/>
+      </w:r>
+      <w:r>
+        <w:rPr>
+          <w:rFonts w:ascii="Liberation Mono" w:hAnsi="Liberation Mono"/>
+          <w:sz w:val="17"/>
+        </w:rPr>
+        <w:t xml:space="preserve">  </w:t>
+      </w:r>
+      <w:r>
+        <w:rPr>
+          <w:rFonts w:ascii="Liberation Mono" w:hAnsi="Liberation Mono"/>
+          <w:sz w:val="17"/>
+        </w:rPr>
+        <w:t>control = safety_kernel.enforce(control, obs)</w:t>
+      </w:r>
+      <w:r>
+        <w:rPr>
+          <w:rFonts w:ascii="Liberation Mono" w:hAnsi="Liberation Mono"/>
+          <w:sz w:val="17"/>
+        </w:rPr>
+        <w:br/>
+      </w:r>
+      <w:r>
+        <w:rPr>
+          <w:rFonts w:ascii="Liberation Mono" w:hAnsi="Liberation Mono"/>
+          <w:sz w:val="17"/>
+        </w:rPr>
+        <w:t xml:space="preserve">  </w:t>
+      </w:r>
+      <w:r>
+        <w:rPr>
+          <w:rFonts w:ascii="Liberation Mono" w:hAnsi="Liberation Mono"/>
+          <w:sz w:val="17"/>
+        </w:rPr>
+        <w:t>actuators.execute(control)</w:t>
+      </w:r>
+      <w:r>
+        <w:rPr>
+          <w:rFonts w:ascii="Liberation Mono" w:hAnsi="Liberation Mono"/>
+          <w:sz w:val="17"/>
+        </w:rPr>
+        <w:br/>
+      </w:r>
+      <w:r>
+        <w:rPr>
+          <w:rFonts w:ascii="Liberation Mono" w:hAnsi="Liberation Mono"/>
+          <w:sz w:val="17"/>
+        </w:rPr>
+        <w:t xml:space="preserve">  </w:t>
+      </w:r>
+      <w:r>
+        <w:rPr>
+          <w:rFonts w:ascii="Liberation Mono" w:hAnsi="Liberation Mono"/>
+          <w:sz w:val="17"/>
+        </w:rPr>
+        <w:t>logger.record(obs, proposal, control, review, response)</w:t>
       </w:r>
     </w:p>
     <w:p>
@@ -4732,20 +5619,62 @@
           <w:sz w:val="17"/>
         </w:rPr>
         <w:br/>
-        <w:t>python -m experiments.run   --scenario crowd_crossing   --mpc on --supervisor on --hrcp on   --episodes 1000 --seed 42</w:t>
+        <w:t>python -m experiments.run</w:t>
       </w:r>
       <w:r>
         <w:rPr>
           <w:rFonts w:ascii="Liberation Mono" w:hAnsi="Liberation Mono"/>
           <w:sz w:val="17"/>
         </w:rPr>
-        <w:br/>
+        <w:t xml:space="preserve"> </w:t>
       </w:r>
       <w:r>
         <w:rPr>
           <w:rFonts w:ascii="Liberation Mono" w:hAnsi="Liberation Mono"/>
           <w:sz w:val="17"/>
         </w:rPr>
+        <w:t xml:space="preserve"> --scenario crowd_crossing</w:t>
+      </w:r>
+      <w:r>
+        <w:rPr>
+          <w:rFonts w:ascii="Liberation Mono" w:hAnsi="Liberation Mono"/>
+          <w:sz w:val="17"/>
+        </w:rPr>
+        <w:t xml:space="preserve"> </w:t>
+      </w:r>
+      <w:r>
+        <w:rPr>
+          <w:rFonts w:ascii="Liberation Mono" w:hAnsi="Liberation Mono"/>
+          <w:sz w:val="17"/>
+        </w:rPr>
+        <w:t xml:space="preserve"> --mpc on --supervisor on --hrcp on</w:t>
+      </w:r>
+      <w:r>
+        <w:rPr>
+          <w:rFonts w:ascii="Liberation Mono" w:hAnsi="Liberation Mono"/>
+          <w:sz w:val="17"/>
+        </w:rPr>
+        <w:t xml:space="preserve"> </w:t>
+      </w:r>
+      <w:r>
+        <w:rPr>
+          <w:rFonts w:ascii="Liberation Mono" w:hAnsi="Liberation Mono"/>
+          <w:sz w:val="17"/>
+        </w:rPr>
+        <w:t xml:space="preserve"> --episodes 1000 --seed 42</w:t>
+      </w:r>
+      <w:r>
+        <w:rPr>
+          <w:rFonts w:ascii="Liberation Mono" w:hAnsi="Liberation Mono"/>
+          <w:sz w:val="17"/>
+        </w:rPr>
+        <w:br/>
+      </w:r>
+      <w:r>
+        <w:rPr>
+          <w:rFonts w:ascii="Liberation Mono" w:hAnsi="Liberation Mono"/>
+          <w:sz w:val="17"/>
+        </w:rPr>
         <w:br/>
         <w:t># Full ablation sweep</w:t>
       </w:r>
@@ -4755,7 +5684,49 @@
           <w:sz w:val="17"/>
         </w:rPr>
         <w:br/>
-        <w:t>python -m experiments.matrix   --factors mpc,supervisor,hrcp   --scenarios nominal,crowd,livestock,faults,adversarial   --seeds 1:20</w:t>
+        <w:t>python -m experiments.matrix</w:t>
+      </w:r>
+      <w:r>
+        <w:rPr>
+          <w:rFonts w:ascii="Liberation Mono" w:hAnsi="Liberation Mono"/>
+          <w:sz w:val="17"/>
+        </w:rPr>
+        <w:t xml:space="preserve"> </w:t>
+      </w:r>
+      <w:r>
+        <w:rPr>
+          <w:rFonts w:ascii="Liberation Mono" w:hAnsi="Liberation Mono"/>
+          <w:sz w:val="17"/>
+        </w:rPr>
+        <w:t xml:space="preserve"> --factors mpc,supervisor,hrcp</w:t>
+      </w:r>
+      <w:r>
+        <w:rPr>
+          <w:rFonts w:ascii="Liberation Mono" w:hAnsi="Liberation Mono"/>
+          <w:sz w:val="17"/>
+        </w:rPr>
+        <w:t xml:space="preserve"> </w:t>
+      </w:r>
+      <w:r>
+        <w:rPr>
+          <w:rFonts w:ascii="Liberation Mono" w:hAnsi="Liberation Mono"/>
+          <w:sz w:val="17"/>
+        </w:rPr>
+        <w:t xml:space="preserve"> --scenarios nominal,crowd,livestock,faults,adversarial</w:t>
+      </w:r>
+      <w:r>
+        <w:rPr>
+          <w:rFonts w:ascii="Liberation Mono" w:hAnsi="Liberation Mono"/>
+          <w:sz w:val="17"/>
+        </w:rPr>
+        <w:t xml:space="preserve"> </w:t>
+      </w:r>
+      <w:r>
+        <w:rPr>
+          <w:rFonts w:ascii="Liberation Mono" w:hAnsi="Liberation Mono"/>
+          <w:sz w:val="17"/>
+        </w:rPr>
+        <w:t xml:space="preserve"> --seeds 1:20</w:t>
       </w:r>
     </w:p>
     <w:p>
@@ -6124,13 +7095,16 @@
         </w:rPr>
       </w:pPr>
       <w:r>
-        <w:t xml:space="preserve">Human demonstration / teleoperation data </w:t>
-      </w:r>
-      <w:r>
-        <w:t xml:space="preserve">, </w:t>
-      </w:r>
-      <w:r>
-        <w:t xml:space="preserve"> expert trajectories and recovery behavior.</w:t>
+        <w:t>Human demonstration / teleoperation data</w:t>
+      </w:r>
+      <w:r>
+        <w:t>,</w:t>
+      </w:r>
+      <w:r>
+        <w:t xml:space="preserve"> </w:t>
+      </w:r>
+      <w:r>
+        <w:t>expert trajectories and recovery behavior.</w:t>
       </w:r>
     </w:p>
     <w:p>
@@ -6141,13 +7115,16 @@
         </w:rPr>
       </w:pPr>
       <w:r>
-        <w:t xml:space="preserve">Simulation data </w:t>
-      </w:r>
-      <w:r>
-        <w:t xml:space="preserve">, </w:t>
-      </w:r>
-      <w:r>
-        <w:t xml:space="preserve"> repeated controlled trajectories and contact-free exploration.</w:t>
+        <w:t>Simulation data</w:t>
+      </w:r>
+      <w:r>
+        <w:t>,</w:t>
+      </w:r>
+      <w:r>
+        <w:t xml:space="preserve"> </w:t>
+      </w:r>
+      <w:r>
+        <w:t>repeated controlled trajectories and contact-free exploration.</w:t>
       </w:r>
     </w:p>
     <w:p>
@@ -6158,13 +7135,16 @@
         </w:rPr>
       </w:pPr>
       <w:r>
-        <w:t xml:space="preserve">Domain-randomized simulation </w:t>
-      </w:r>
-      <w:r>
-        <w:t xml:space="preserve">, </w:t>
-      </w:r>
-      <w:r>
-        <w:t xml:space="preserve"> friction, lighting, payload, sensor noise, human motion, actuator delay and environment geometry.</w:t>
+        <w:t>Domain-randomized simulation</w:t>
+      </w:r>
+      <w:r>
+        <w:t>,</w:t>
+      </w:r>
+      <w:r>
+        <w:t xml:space="preserve"> </w:t>
+      </w:r>
+      <w:r>
+        <w:t>friction, lighting, payload, sensor noise, human motion, actuator delay and environment geometry.</w:t>
       </w:r>
     </w:p>
     <w:p>
@@ -6175,13 +7155,16 @@
         </w:rPr>
       </w:pPr>
       <w:r>
-        <w:t xml:space="preserve">Synthetic adversarial scenarios </w:t>
-      </w:r>
-      <w:r>
-        <w:t xml:space="preserve">, </w:t>
-      </w:r>
-      <w:r>
-        <w:t xml:space="preserve"> automatically generated near-misses, OOD requests, misleading instructions and sensor inconsistencies.</w:t>
+        <w:t>Synthetic adversarial scenarios</w:t>
+      </w:r>
+      <w:r>
+        <w:t>,</w:t>
+      </w:r>
+      <w:r>
+        <w:t xml:space="preserve"> </w:t>
+      </w:r>
+      <w:r>
+        <w:t>automatically generated near-misses, OOD requests, misleading instructions and sensor inconsistencies.</w:t>
       </w:r>
     </w:p>
     <w:p>
@@ -6192,13 +7175,16 @@
         </w:rPr>
       </w:pPr>
       <w:r>
-        <w:t xml:space="preserve">Controlled physical-lab data </w:t>
-      </w:r>
-      <w:r>
-        <w:t xml:space="preserve">, </w:t>
-      </w:r>
-      <w:r>
-        <w:t xml:space="preserve"> instrumented dummies, soft obstacles, force-limited setups and supervised human interaction.</w:t>
+        <w:t>Controlled physical-lab data</w:t>
+      </w:r>
+      <w:r>
+        <w:t>,</w:t>
+      </w:r>
+      <w:r>
+        <w:t xml:space="preserve"> </w:t>
+      </w:r>
+      <w:r>
+        <w:t>instrumented dummies, soft obstacles, force-limited setups and supervised human interaction.</w:t>
       </w:r>
     </w:p>
     <w:p>
@@ -6209,13 +7195,16 @@
         </w:rPr>
       </w:pPr>
       <w:r>
-        <w:t xml:space="preserve">Fleet/field data </w:t>
-      </w:r>
-      <w:r>
-        <w:t xml:space="preserve">, </w:t>
-      </w:r>
-      <w:r>
-        <w:t xml:space="preserve"> operational telemetry, near misses and policy regressions, with privacy/security controls.</w:t>
+        <w:t>Fleet/field data</w:t>
+      </w:r>
+      <w:r>
+        <w:t>,</w:t>
+      </w:r>
+      <w:r>
+        <w:t xml:space="preserve"> </w:t>
+      </w:r>
+      <w:r>
+        <w:t>operational telemetry, near misses and policy regressions, with privacy/security controls.</w:t>
       </w:r>
     </w:p>
     <w:p>
@@ -6226,13 +7215,16 @@
         </w:rPr>
       </w:pPr>
       <w:r>
-        <w:t xml:space="preserve">Incident replay </w:t>
-      </w:r>
-      <w:r>
-        <w:t xml:space="preserve">, </w:t>
-      </w:r>
-      <w:r>
-        <w:t xml:space="preserve"> reconstruct known or plausible failure chains to test whether each layer would have interrupted escalation.</w:t>
+        <w:t>Incident replay</w:t>
+      </w:r>
+      <w:r>
+        <w:t>,</w:t>
+      </w:r>
+      <w:r>
+        <w:t xml:space="preserve"> </w:t>
+      </w:r>
+      <w:r>
+        <w:t>reconstruct known or plausible failure chains to test whether each layer would have interrupted escalation.</w:t>
       </w:r>
     </w:p>
     <w:p>
@@ -7147,13 +8139,7 @@
         <w:jc w:val="center"/>
       </w:pPr>
       <w:r>
-        <w:t>TSR = 100 × [ Σ</w:t>
-      </w:r>
-      <w:r>
-        <w:t>ᵢ</w:t>
-      </w:r>
-      <w:r>
-        <w:t xml:space="preserve"> T(i) ] / N</w:t>
+        <w:t>TSR = 100 × [ Σᵢ T(i) ] / N</w:t>
       </w:r>
     </w:p>
     <w:p>
@@ -7162,13 +8148,7 @@
         <w:jc w:val="center"/>
       </w:pPr>
       <w:r>
-        <w:t>SMSR = 100 × Σ</w:t>
-      </w:r>
-      <w:r>
-        <w:t>ᵢ</w:t>
-      </w:r>
-      <w:r>
-        <w:t xml:space="preserve"> { T(i)·[1−C(i)]·[1−U(i)]·G(i) } / N</w:t>
+        <w:t>SMSR = 100 × Σᵢ { T(i)·[1−C(i)]·[1−U(i)]·G(i) } / N</w:t>
       </w:r>
     </w:p>
     <w:p>
@@ -7177,13 +8157,7 @@
         <w:jc w:val="center"/>
       </w:pPr>
       <w:r>
-        <w:t>CSVR = 1000 × [ Σ</w:t>
-      </w:r>
-      <w:r>
-        <w:t>ᵢ</w:t>
-      </w:r>
-      <w:r>
-        <w:t xml:space="preserve"> C(i) ] / T_exp</w:t>
+        <w:t>CSVR = 1000 × [ Σᵢ C(i) ] / T_exp</w:t>
       </w:r>
     </w:p>
     <w:p>
@@ -7192,13 +8166,7 @@
         <w:jc w:val="center"/>
       </w:pPr>
       <w:r>
-        <w:t>SWRR = 1000 × Σ</w:t>
-      </w:r>
-      <w:r>
-        <w:t>ᵢ</w:t>
-      </w:r>
-      <w:r>
-        <w:t xml:space="preserve"> [ wC·C(i) + wN·N(i) + wU·U(i) + wF·F(i) ] / T_exp</w:t>
+        <w:t>SWRR = 1000 × Σᵢ [ wC·C(i) + wN·N(i) + wU·U(i) + wF·F(i) ] / T_exp</w:t>
       </w:r>
     </w:p>
     <w:p>
@@ -8263,10 +9231,7 @@
         </w:rPr>
       </w:pPr>
       <w:r>
-        <w:t>This is a proposed research integration, not a claim of an NVIDIA–Unitree vendor-supported stack. GR00T 1.7 can be treated as the high-level VLA/embodied policy reference, while Unitree G1 locomotion is supplied by the public Unitree RL Lab stack. NVIDIA reports that GR00T 1.7 was pretrained on approximately 32,000 hours of real demonstrations/human egocentric data plus approximately 8,000 hours of simulated data [20]. Unitree RL Lab supports G1/H1/Go2 training in Isaac Lab and explicitly uses a Sim2Sim (Mu</w:t>
-      </w:r>
-      <w:r>
-        <w:t>JoCo) step before Sim2Real deployment [22]. Isaac Lab-Arena provides a scalable evaluation layer for diversified simulation benchmarks [21].</w:t>
+        <w:t>This is a proposed research integration, not a claim of an NVIDIA–Unitree vendor-supported stack. GR00T 1.7 can be treated as the high-level VLA/embodied policy reference, while Unitree G1 locomotion is supplied by the public Unitree RL Lab stack. NVIDIA reports that GR00T 1.7 was pretrained on approximately 32,000 hours of real demonstrations/human egocentric data plus approximately 8,000 hours of simulated data [20]. Unitree RL Lab supports G1/H1/Go2 training in Isaac Lab and explicitly uses a Sim2Sim (MuJoCo) step before Sim2Real deployment [22]. Isaac Lab-Arena provides a scalable evaluation layer for diversified simulation benchmarks [21].</w:t>
       </w:r>
     </w:p>
     <w:tbl>
@@ -8977,10 +9942,7 @@
         </w:rPr>
       </w:pPr>
       <w:r>
-        <w:t>Scenario: a Unitree G1-class humanoid is asked to carry a tote through a shared warehouse aisle. The GR00T-style policy proposes the manipulation/navigation target; the Unitree RL policy supplies locomotion; domain-randomized simulation varies friction, lighting, payload, human trajectories, sensor noise and delay. Adversarial trials include a person entering the predicted path, camera occlusion, an instruction attempting to bypass a wait zone, and forged/absent acknowledgement. Physical testing would retai</w:t>
-      </w:r>
-      <w:r>
-        <w:t>n all independent hardware safeguards.</w:t>
+        <w:t>Scenario: a Unitree G1-class humanoid is asked to carry a tote through a shared warehouse aisle. The GR00T-style policy proposes the manipulation/navigation target; the Unitree RL policy supplies locomotion; domain-randomized simulation varies friction, lighting, payload, human trajectories, sensor noise and delay. Adversarial trials include a person entering the predicted path, camera occlusion, an instruction attempting to bypass a wait zone, and forged/absent acknowledgement. Physical testing would retain all independent hardware safeguards.</w:t>
       </w:r>
     </w:p>
     <w:p>
@@ -9874,7 +10836,31 @@
         <w:jc w:val="center"/>
       </w:pPr>
       <w:r>
-        <w:t>B₁ = { ‖eₓ‖≤εₓ;  ‖f−f̂‖≤ε_f;  τ_ctrl≤τ_ctrl,max;  feasible=1;  η_act≥η_min }</w:t>
+        <w:t>B₁ = { ‖eₓ‖≤εₓ;</w:t>
+      </w:r>
+      <w:r>
+        <w:t xml:space="preserve"> </w:t>
+      </w:r>
+      <w:r>
+        <w:t>‖f−f̂‖≤ε_f;</w:t>
+      </w:r>
+      <w:r>
+        <w:t xml:space="preserve"> </w:t>
+      </w:r>
+      <w:r>
+        <w:t>τ_ctrl≤τ_ctrl,max;</w:t>
+      </w:r>
+      <w:r>
+        <w:t xml:space="preserve"> </w:t>
+      </w:r>
+      <w:r>
+        <w:t>feasible=1;</w:t>
+      </w:r>
+      <w:r>
+        <w:t xml:space="preserve"> </w:t>
+      </w:r>
+      <w:r>
+        <w:t>η_act≥η_min }</w:t>
       </w:r>
     </w:p>
     <w:p>
@@ -9986,7 +10972,31 @@
         <w:jc w:val="center"/>
       </w:pPr>
       <w:r>
-        <w:t>B₂ = { τ_sup≤τ_hazard;  FNR_sup≤β_max;  corr(E_worker,E_supervisor)≤ρ_max;  P(bypass)=0;  FSR_sup≤α_max }</w:t>
+        <w:t>B₂ = { τ_sup≤τ_hazard;</w:t>
+      </w:r>
+      <w:r>
+        <w:t xml:space="preserve"> </w:t>
+      </w:r>
+      <w:r>
+        <w:t>FNR_sup≤β_max;</w:t>
+      </w:r>
+      <w:r>
+        <w:t xml:space="preserve"> </w:t>
+      </w:r>
+      <w:r>
+        <w:t>corr(E_worker,E_supervisor)≤ρ_max;</w:t>
+      </w:r>
+      <w:r>
+        <w:t xml:space="preserve"> </w:t>
+      </w:r>
+      <w:r>
+        <w:t>P(bypass)=0;</w:t>
+      </w:r>
+      <w:r>
+        <w:t xml:space="preserve"> </w:t>
+      </w:r>
+      <w:r>
+        <w:t>FSR_sup≤α_max }</w:t>
       </w:r>
     </w:p>
     <w:p>
@@ -9995,7 +11005,19 @@
         <w:jc w:val="center"/>
       </w:pPr>
       <w:r>
-        <w:t>b₂* = inf { b : ΔRisk_H2(b)≤0  or  ΔTaskSuccess_H2(b)&lt;−δ_task }</w:t>
+        <w:t>b₂* = inf { b : ΔRisk_H2(b)≤0</w:t>
+      </w:r>
+      <w:r>
+        <w:t xml:space="preserve"> </w:t>
+      </w:r>
+      <w:r>
+        <w:t>or</w:t>
+      </w:r>
+      <w:r>
+        <w:t xml:space="preserve"> </w:t>
+      </w:r>
+      <w:r>
+        <w:t>ΔTaskSuccess_H2(b)&lt;−δ_task }</w:t>
       </w:r>
     </w:p>
     <w:p>
@@ -10099,7 +11121,31 @@
         <w:jc w:val="center"/>
       </w:pPr>
       <w:r>
-        <w:t>B₃ = { τ_ack&lt;τ_hazard;  q_channel≥q_min;  comprehension≥a_min;  P(forged ACK)≤p_max;  H(recipient)≤H_max }</w:t>
+        <w:t>B₃ = { τ_ack&lt;τ_hazard;</w:t>
+      </w:r>
+      <w:r>
+        <w:t xml:space="preserve"> </w:t>
+      </w:r>
+      <w:r>
+        <w:t>q_channel≥q_min;</w:t>
+      </w:r>
+      <w:r>
+        <w:t xml:space="preserve"> </w:t>
+      </w:r>
+      <w:r>
+        <w:t>comprehension≥a_min;</w:t>
+      </w:r>
+      <w:r>
+        <w:t xml:space="preserve"> </w:t>
+      </w:r>
+      <w:r>
+        <w:t>P(forged ACK)≤p_max;</w:t>
+      </w:r>
+      <w:r>
+        <w:t xml:space="preserve"> </w:t>
+      </w:r>
+      <w:r>
+        <w:t>H(recipient)≤H_max }</w:t>
       </w:r>
     </w:p>
     <w:p>
@@ -10108,7 +11154,19 @@
         <w:jc w:val="center"/>
       </w:pPr>
       <w:r>
-        <w:t>b₃* = inf { b : ΔCCR_H3(b)≤0  or  AckLatency(b)≥τ_hazard }</w:t>
+        <w:t>b₃* = inf { b : ΔCCR_H3(b)≤0</w:t>
+      </w:r>
+      <w:r>
+        <w:t xml:space="preserve"> </w:t>
+      </w:r>
+      <w:r>
+        <w:t>or</w:t>
+      </w:r>
+      <w:r>
+        <w:t xml:space="preserve"> </w:t>
+      </w:r>
+      <w:r>
+        <w:t>AckLatency(b)≥τ_hazard }</w:t>
       </w:r>
     </w:p>
     <w:p>
@@ -11257,13 +12315,16 @@
         <w:t xml:space="preserve">[3] </w:t>
       </w:r>
       <w:r>
-        <w:t xml:space="preserve">Google DeepMind. “Evals </w:t>
-      </w:r>
-      <w:r>
-        <w:t xml:space="preserve">, </w:t>
-      </w:r>
-      <w:r>
-        <w:t xml:space="preserve"> ASIMOV-Agentic-v1.” Robotics safety benchmark. </w:t>
+        <w:t>Google DeepMind. “Evals</w:t>
+      </w:r>
+      <w:r>
+        <w:t>,</w:t>
+      </w:r>
+      <w:r>
+        <w:t xml:space="preserve"> </w:t>
+      </w:r>
+      <w:r>
+        <w:t xml:space="preserve">ASIMOV-Agentic-v1.” Robotics safety benchmark. </w:t>
       </w:r>
       <w:r>
         <w:rPr>
@@ -11383,13 +12444,16 @@
         <w:t xml:space="preserve">[8] </w:t>
       </w:r>
       <w:r>
-        <w:t xml:space="preserve">NVIDIA. “Isaac GR00T </w:t>
-      </w:r>
-      <w:r>
-        <w:t xml:space="preserve">, </w:t>
-      </w:r>
-      <w:r>
-        <w:t xml:space="preserve"> Generalist Robot 00 Technology.” </w:t>
+        <w:t>NVIDIA. “Isaac GR00T</w:t>
+      </w:r>
+      <w:r>
+        <w:t>,</w:t>
+      </w:r>
+      <w:r>
+        <w:t xml:space="preserve"> </w:t>
+      </w:r>
+      <w:r>
+        <w:t xml:space="preserve">Generalist Robot 00 Technology.” </w:t>
       </w:r>
       <w:r>
         <w:rPr>
@@ -11461,19 +12525,25 @@
         <w:t xml:space="preserve">[11] </w:t>
       </w:r>
       <w:r>
-        <w:t xml:space="preserve">ISO 10218-1:2025. Robotics </w:t>
-      </w:r>
-      <w:r>
-        <w:t xml:space="preserve">, </w:t>
-      </w:r>
-      <w:r>
-        <w:t xml:space="preserve"> Safety requirements </w:t>
-      </w:r>
-      <w:r>
-        <w:t xml:space="preserve">, </w:t>
-      </w:r>
-      <w:r>
-        <w:t xml:space="preserve"> Part 1: Industrial robots. </w:t>
+        <w:t>ISO 10218-1:2025. Robotics</w:t>
+      </w:r>
+      <w:r>
+        <w:t>,</w:t>
+      </w:r>
+      <w:r>
+        <w:t xml:space="preserve"> </w:t>
+      </w:r>
+      <w:r>
+        <w:t>Safety requirements</w:t>
+      </w:r>
+      <w:r>
+        <w:t>,</w:t>
+      </w:r>
+      <w:r>
+        <w:t xml:space="preserve"> </w:t>
+      </w:r>
+      <w:r>
+        <w:t xml:space="preserve">Part 1: Industrial robots. </w:t>
       </w:r>
       <w:r>
         <w:rPr>
@@ -11497,19 +12567,25 @@
         <w:t xml:space="preserve">[12] </w:t>
       </w:r>
       <w:r>
-        <w:t xml:space="preserve">ISO 10218-2:2025. Robotics </w:t>
-      </w:r>
-      <w:r>
-        <w:t xml:space="preserve">, </w:t>
-      </w:r>
-      <w:r>
-        <w:t xml:space="preserve"> Safety requirements </w:t>
-      </w:r>
-      <w:r>
-        <w:t xml:space="preserve">, </w:t>
-      </w:r>
-      <w:r>
-        <w:t xml:space="preserve"> Part 2: Industrial robot applications and robot cells. </w:t>
+        <w:t>ISO 10218-2:2025. Robotics</w:t>
+      </w:r>
+      <w:r>
+        <w:t>,</w:t>
+      </w:r>
+      <w:r>
+        <w:t xml:space="preserve"> </w:t>
+      </w:r>
+      <w:r>
+        <w:t>Safety requirements</w:t>
+      </w:r>
+      <w:r>
+        <w:t>,</w:t>
+      </w:r>
+      <w:r>
+        <w:t xml:space="preserve"> </w:t>
+      </w:r>
+      <w:r>
+        <w:t xml:space="preserve">Part 2: Industrial robot applications and robot cells. </w:t>
       </w:r>
       <w:r>
         <w:rPr>
@@ -11533,13 +12609,16 @@
         <w:t xml:space="preserve">[13] </w:t>
       </w:r>
       <w:r>
-        <w:t xml:space="preserve">ISO/FDIS 13482 (2026). Robotics </w:t>
-      </w:r>
-      <w:r>
-        <w:t xml:space="preserve">, </w:t>
-      </w:r>
-      <w:r>
-        <w:t xml:space="preserve"> Safety requirements for service robots. </w:t>
+        <w:t>ISO/FDIS 13482 (2026). Robotics</w:t>
+      </w:r>
+      <w:r>
+        <w:t>,</w:t>
+      </w:r>
+      <w:r>
+        <w:t xml:space="preserve"> </w:t>
+      </w:r>
+      <w:r>
+        <w:t xml:space="preserve">Safety requirements for service robots. </w:t>
       </w:r>
       <w:r>
         <w:rPr>
@@ -11563,19 +12642,25 @@
         <w:t xml:space="preserve">[14] </w:t>
       </w:r>
       <w:r>
-        <w:t xml:space="preserve">ISO 21423 (under publication, 2026). Robotics </w:t>
-      </w:r>
-      <w:r>
-        <w:t xml:space="preserve">, </w:t>
-      </w:r>
-      <w:r>
-        <w:t xml:space="preserve"> Industrial mobile robots </w:t>
-      </w:r>
-      <w:r>
-        <w:t xml:space="preserve">, </w:t>
-      </w:r>
-      <w:r>
-        <w:t xml:space="preserve"> Communications and interoperability. </w:t>
+        <w:t>ISO 21423 (under publication, 2026). Robotics</w:t>
+      </w:r>
+      <w:r>
+        <w:t>,</w:t>
+      </w:r>
+      <w:r>
+        <w:t xml:space="preserve"> </w:t>
+      </w:r>
+      <w:r>
+        <w:t>Industrial mobile robots</w:t>
+      </w:r>
+      <w:r>
+        <w:t>,</w:t>
+      </w:r>
+      <w:r>
+        <w:t xml:space="preserve"> </w:t>
+      </w:r>
+      <w:r>
+        <w:t xml:space="preserve">Communications and interoperability. </w:t>
       </w:r>
       <w:r>
         <w:rPr>
@@ -11783,13 +12868,16 @@
         <w:pStyle w:val="Heading1"/>
       </w:pPr>
       <w:r>
-        <w:t xml:space="preserve">Appendix A </w:t>
-      </w:r>
-      <w:r>
-        <w:t xml:space="preserve">, </w:t>
-      </w:r>
-      <w:r>
-        <w:t xml:space="preserve"> Minimum experiment configuration</w:t>
+        <w:t>Appendix A</w:t>
+      </w:r>
+      <w:r>
+        <w:t>,</w:t>
+      </w:r>
+      <w:r>
+        <w:t xml:space="preserve"> </w:t>
+      </w:r>
+      <w:r>
+        <w:t>Minimum experiment configuration</w:t>
       </w:r>
     </w:p>
     <w:p>
@@ -11813,23 +12901,20 @@
           <w:sz w:val="17"/>
         </w:rPr>
         <w:br/>
-        <w:t xml:space="preserve">  simulator: mujoco</w:t>
       </w:r>
       <w:r>
         <w:rPr>
           <w:rFonts w:ascii="Liberation Mono" w:hAnsi="Liberation Mono"/>
           <w:sz w:val="17"/>
         </w:rPr>
-        <w:br/>
-        <w:t xml:space="preserve">  episodes_per_condition: 1000</w:t>
+        <w:t xml:space="preserve"> </w:t>
       </w:r>
       <w:r>
         <w:rPr>
           <w:rFonts w:ascii="Liberation Mono" w:hAnsi="Liberation Mono"/>
           <w:sz w:val="17"/>
         </w:rPr>
-        <w:br/>
-        <w:t xml:space="preserve">  seeds: 20</w:t>
+        <w:t>simulator: mujoco</w:t>
       </w:r>
       <w:r>
         <w:rPr>
@@ -11837,23 +12922,20 @@
           <w:sz w:val="17"/>
         </w:rPr>
         <w:br/>
-        <w:t xml:space="preserve">  factors:</w:t>
       </w:r>
       <w:r>
         <w:rPr>
           <w:rFonts w:ascii="Liberation Mono" w:hAnsi="Liberation Mono"/>
           <w:sz w:val="17"/>
         </w:rPr>
-        <w:br/>
-        <w:t xml:space="preserve">    mpc_filter: [off, on]</w:t>
+        <w:t xml:space="preserve"> </w:t>
       </w:r>
       <w:r>
         <w:rPr>
           <w:rFonts w:ascii="Liberation Mono" w:hAnsi="Liberation Mono"/>
           <w:sz w:val="17"/>
         </w:rPr>
-        <w:br/>
-        <w:t xml:space="preserve">    supervisor: [off, on]</w:t>
+        <w:t>episodes_per_condition: 1000</w:t>
       </w:r>
       <w:r>
         <w:rPr>
@@ -11861,23 +12943,20 @@
           <w:sz w:val="17"/>
         </w:rPr>
         <w:br/>
-        <w:t xml:space="preserve">    hrcp: [off, on]</w:t>
       </w:r>
       <w:r>
         <w:rPr>
           <w:rFonts w:ascii="Liberation Mono" w:hAnsi="Liberation Mono"/>
           <w:sz w:val="17"/>
         </w:rPr>
-        <w:br/>
-        <w:t xml:space="preserve">  scenario_mix:</w:t>
+        <w:t xml:space="preserve"> </w:t>
       </w:r>
       <w:r>
         <w:rPr>
           <w:rFonts w:ascii="Liberation Mono" w:hAnsi="Liberation Mono"/>
           <w:sz w:val="17"/>
         </w:rPr>
-        <w:br/>
-        <w:t xml:space="preserve">    nominal: 0.30</w:t>
+        <w:t>seeds: 20</w:t>
       </w:r>
       <w:r>
         <w:rPr>
@@ -11885,23 +12964,20 @@
           <w:sz w:val="17"/>
         </w:rPr>
         <w:br/>
-        <w:t xml:space="preserve">    human_proximity: 0.15</w:t>
       </w:r>
       <w:r>
         <w:rPr>
           <w:rFonts w:ascii="Liberation Mono" w:hAnsi="Liberation Mono"/>
           <w:sz w:val="17"/>
         </w:rPr>
-        <w:br/>
-        <w:t xml:space="preserve">    crowd: 0.10</w:t>
+        <w:t xml:space="preserve"> </w:t>
       </w:r>
       <w:r>
         <w:rPr>
           <w:rFonts w:ascii="Liberation Mono" w:hAnsi="Liberation Mono"/>
           <w:sz w:val="17"/>
         </w:rPr>
-        <w:br/>
-        <w:t xml:space="preserve">    livestock: 0.10</w:t>
+        <w:t>factors:</w:t>
       </w:r>
       <w:r>
         <w:rPr>
@@ -11915,15 +12991,14 @@
           <w:rFonts w:ascii="Liberation Mono" w:hAnsi="Liberation Mono"/>
           <w:sz w:val="17"/>
         </w:rPr>
-        <w:t xml:space="preserve">    sensor_fault: 0.10</w:t>
+        <w:t xml:space="preserve">  </w:t>
       </w:r>
       <w:r>
         <w:rPr>
           <w:rFonts w:ascii="Liberation Mono" w:hAnsi="Liberation Mono"/>
           <w:sz w:val="17"/>
         </w:rPr>
-        <w:br/>
-        <w:t xml:space="preserve">    world_model_error: 0.05</w:t>
+        <w:t>mpc_filter: [off, on]</w:t>
       </w:r>
       <w:r>
         <w:rPr>
@@ -11931,23 +13006,20 @@
           <w:sz w:val="17"/>
         </w:rPr>
         <w:br/>
-        <w:t xml:space="preserve">    latency: 0.05</w:t>
       </w:r>
       <w:r>
         <w:rPr>
           <w:rFonts w:ascii="Liberation Mono" w:hAnsi="Liberation Mono"/>
           <w:sz w:val="17"/>
         </w:rPr>
-        <w:br/>
-        <w:t xml:space="preserve">    adversarial_goal: 0.05</w:t>
+        <w:t xml:space="preserve">  </w:t>
       </w:r>
       <w:r>
         <w:rPr>
           <w:rFonts w:ascii="Liberation Mono" w:hAnsi="Liberation Mono"/>
           <w:sz w:val="17"/>
         </w:rPr>
-        <w:br/>
-        <w:t xml:space="preserve">    identity_or_consent_spoof: 0.05</w:t>
+        <w:t>supervisor: [off, on]</w:t>
       </w:r>
       <w:r>
         <w:rPr>
@@ -11955,23 +13027,20 @@
           <w:sz w:val="17"/>
         </w:rPr>
         <w:br/>
-        <w:t xml:space="preserve">    hardware_fault: 0.05</w:t>
       </w:r>
       <w:r>
         <w:rPr>
           <w:rFonts w:ascii="Liberation Mono" w:hAnsi="Liberation Mono"/>
           <w:sz w:val="17"/>
         </w:rPr>
-        <w:br/>
-        <w:t xml:space="preserve">  primary_endpoint: critical_safety_violation_rate</w:t>
+        <w:t xml:space="preserve">  </w:t>
       </w:r>
       <w:r>
         <w:rPr>
           <w:rFonts w:ascii="Liberation Mono" w:hAnsi="Liberation Mono"/>
           <w:sz w:val="17"/>
         </w:rPr>
-        <w:br/>
-        <w:t xml:space="preserve">  secondary_endpoints:</w:t>
+        <w:t>hrcp: [off, on]</w:t>
       </w:r>
       <w:r>
         <w:rPr>
@@ -11979,23 +13048,20 @@
           <w:sz w:val="17"/>
         </w:rPr>
         <w:br/>
-        <w:t xml:space="preserve">    - task_success</w:t>
       </w:r>
       <w:r>
         <w:rPr>
           <w:rFonts w:ascii="Liberation Mono" w:hAnsi="Liberation Mono"/>
           <w:sz w:val="17"/>
         </w:rPr>
-        <w:br/>
-        <w:t xml:space="preserve">    - minimum_safety_margin</w:t>
+        <w:t xml:space="preserve"> </w:t>
       </w:r>
       <w:r>
         <w:rPr>
           <w:rFonts w:ascii="Liberation Mono" w:hAnsi="Liberation Mono"/>
           <w:sz w:val="17"/>
         </w:rPr>
-        <w:br/>
-        <w:t xml:space="preserve">    - intervention_recall</w:t>
+        <w:t>scenario_mix:</w:t>
       </w:r>
       <w:r>
         <w:rPr>
@@ -12003,23 +13069,20 @@
           <w:sz w:val="17"/>
         </w:rPr>
         <w:br/>
-        <w:t xml:space="preserve">    - false_stop_rate</w:t>
       </w:r>
       <w:r>
         <w:rPr>
           <w:rFonts w:ascii="Liberation Mono" w:hAnsi="Liberation Mono"/>
           <w:sz w:val="17"/>
         </w:rPr>
-        <w:br/>
-        <w:t xml:space="preserve">    - p95_decision_latency</w:t>
+        <w:t xml:space="preserve">  </w:t>
       </w:r>
       <w:r>
         <w:rPr>
           <w:rFonts w:ascii="Liberation Mono" w:hAnsi="Liberation Mono"/>
           <w:sz w:val="17"/>
         </w:rPr>
-        <w:br/>
-        <w:t xml:space="preserve">    - coordination_conflict_rate</w:t>
+        <w:t>nominal: 0.30</w:t>
       </w:r>
       <w:r>
         <w:rPr>
@@ -12027,7 +13090,377 @@
           <w:sz w:val="17"/>
         </w:rPr>
         <w:br/>
-        <w:t xml:space="preserve">    - attack_success_rate</w:t>
+      </w:r>
+      <w:r>
+        <w:rPr>
+          <w:rFonts w:ascii="Liberation Mono" w:hAnsi="Liberation Mono"/>
+          <w:sz w:val="17"/>
+        </w:rPr>
+        <w:t xml:space="preserve">  </w:t>
+      </w:r>
+      <w:r>
+        <w:rPr>
+          <w:rFonts w:ascii="Liberation Mono" w:hAnsi="Liberation Mono"/>
+          <w:sz w:val="17"/>
+        </w:rPr>
+        <w:t>human_proximity: 0.15</w:t>
+      </w:r>
+      <w:r>
+        <w:rPr>
+          <w:rFonts w:ascii="Liberation Mono" w:hAnsi="Liberation Mono"/>
+          <w:sz w:val="17"/>
+        </w:rPr>
+        <w:br/>
+      </w:r>
+      <w:r>
+        <w:rPr>
+          <w:rFonts w:ascii="Liberation Mono" w:hAnsi="Liberation Mono"/>
+          <w:sz w:val="17"/>
+        </w:rPr>
+        <w:t xml:space="preserve">  </w:t>
+      </w:r>
+      <w:r>
+        <w:rPr>
+          <w:rFonts w:ascii="Liberation Mono" w:hAnsi="Liberation Mono"/>
+          <w:sz w:val="17"/>
+        </w:rPr>
+        <w:t>crowd: 0.10</w:t>
+      </w:r>
+      <w:r>
+        <w:rPr>
+          <w:rFonts w:ascii="Liberation Mono" w:hAnsi="Liberation Mono"/>
+          <w:sz w:val="17"/>
+        </w:rPr>
+        <w:br/>
+      </w:r>
+      <w:r>
+        <w:rPr>
+          <w:rFonts w:ascii="Liberation Mono" w:hAnsi="Liberation Mono"/>
+          <w:sz w:val="17"/>
+        </w:rPr>
+        <w:t xml:space="preserve">  </w:t>
+      </w:r>
+      <w:r>
+        <w:rPr>
+          <w:rFonts w:ascii="Liberation Mono" w:hAnsi="Liberation Mono"/>
+          <w:sz w:val="17"/>
+        </w:rPr>
+        <w:t>livestock: 0.10</w:t>
+      </w:r>
+      <w:r>
+        <w:rPr>
+          <w:rFonts w:ascii="Liberation Mono" w:hAnsi="Liberation Mono"/>
+          <w:sz w:val="17"/>
+        </w:rPr>
+        <w:br/>
+      </w:r>
+      <w:r>
+        <w:rPr>
+          <w:rFonts w:ascii="Liberation Mono" w:hAnsi="Liberation Mono"/>
+          <w:sz w:val="17"/>
+        </w:rPr>
+        <w:t xml:space="preserve">  </w:t>
+      </w:r>
+      <w:r>
+        <w:rPr>
+          <w:rFonts w:ascii="Liberation Mono" w:hAnsi="Liberation Mono"/>
+          <w:sz w:val="17"/>
+        </w:rPr>
+        <w:t>sensor_fault: 0.10</w:t>
+      </w:r>
+      <w:r>
+        <w:rPr>
+          <w:rFonts w:ascii="Liberation Mono" w:hAnsi="Liberation Mono"/>
+          <w:sz w:val="17"/>
+        </w:rPr>
+        <w:br/>
+      </w:r>
+      <w:r>
+        <w:rPr>
+          <w:rFonts w:ascii="Liberation Mono" w:hAnsi="Liberation Mono"/>
+          <w:sz w:val="17"/>
+        </w:rPr>
+        <w:t xml:space="preserve">  </w:t>
+      </w:r>
+      <w:r>
+        <w:rPr>
+          <w:rFonts w:ascii="Liberation Mono" w:hAnsi="Liberation Mono"/>
+          <w:sz w:val="17"/>
+        </w:rPr>
+        <w:t>world_model_error: 0.05</w:t>
+      </w:r>
+      <w:r>
+        <w:rPr>
+          <w:rFonts w:ascii="Liberation Mono" w:hAnsi="Liberation Mono"/>
+          <w:sz w:val="17"/>
+        </w:rPr>
+        <w:br/>
+      </w:r>
+      <w:r>
+        <w:rPr>
+          <w:rFonts w:ascii="Liberation Mono" w:hAnsi="Liberation Mono"/>
+          <w:sz w:val="17"/>
+        </w:rPr>
+        <w:t xml:space="preserve">  </w:t>
+      </w:r>
+      <w:r>
+        <w:rPr>
+          <w:rFonts w:ascii="Liberation Mono" w:hAnsi="Liberation Mono"/>
+          <w:sz w:val="17"/>
+        </w:rPr>
+        <w:t>latency: 0.05</w:t>
+      </w:r>
+      <w:r>
+        <w:rPr>
+          <w:rFonts w:ascii="Liberation Mono" w:hAnsi="Liberation Mono"/>
+          <w:sz w:val="17"/>
+        </w:rPr>
+        <w:br/>
+      </w:r>
+      <w:r>
+        <w:rPr>
+          <w:rFonts w:ascii="Liberation Mono" w:hAnsi="Liberation Mono"/>
+          <w:sz w:val="17"/>
+        </w:rPr>
+        <w:t xml:space="preserve">  </w:t>
+      </w:r>
+      <w:r>
+        <w:rPr>
+          <w:rFonts w:ascii="Liberation Mono" w:hAnsi="Liberation Mono"/>
+          <w:sz w:val="17"/>
+        </w:rPr>
+        <w:t>adversarial_goal: 0.05</w:t>
+      </w:r>
+      <w:r>
+        <w:rPr>
+          <w:rFonts w:ascii="Liberation Mono" w:hAnsi="Liberation Mono"/>
+          <w:sz w:val="17"/>
+        </w:rPr>
+        <w:br/>
+      </w:r>
+      <w:r>
+        <w:rPr>
+          <w:rFonts w:ascii="Liberation Mono" w:hAnsi="Liberation Mono"/>
+          <w:sz w:val="17"/>
+        </w:rPr>
+        <w:t xml:space="preserve">  </w:t>
+      </w:r>
+      <w:r>
+        <w:rPr>
+          <w:rFonts w:ascii="Liberation Mono" w:hAnsi="Liberation Mono"/>
+          <w:sz w:val="17"/>
+        </w:rPr>
+        <w:t>identity_or_consent_spoof: 0.05</w:t>
+      </w:r>
+      <w:r>
+        <w:rPr>
+          <w:rFonts w:ascii="Liberation Mono" w:hAnsi="Liberation Mono"/>
+          <w:sz w:val="17"/>
+        </w:rPr>
+        <w:br/>
+      </w:r>
+      <w:r>
+        <w:rPr>
+          <w:rFonts w:ascii="Liberation Mono" w:hAnsi="Liberation Mono"/>
+          <w:sz w:val="17"/>
+        </w:rPr>
+        <w:t xml:space="preserve">  </w:t>
+      </w:r>
+      <w:r>
+        <w:rPr>
+          <w:rFonts w:ascii="Liberation Mono" w:hAnsi="Liberation Mono"/>
+          <w:sz w:val="17"/>
+        </w:rPr>
+        <w:t>hardware_fault: 0.05</w:t>
+      </w:r>
+      <w:r>
+        <w:rPr>
+          <w:rFonts w:ascii="Liberation Mono" w:hAnsi="Liberation Mono"/>
+          <w:sz w:val="17"/>
+        </w:rPr>
+        <w:br/>
+      </w:r>
+      <w:r>
+        <w:rPr>
+          <w:rFonts w:ascii="Liberation Mono" w:hAnsi="Liberation Mono"/>
+          <w:sz w:val="17"/>
+        </w:rPr>
+        <w:t xml:space="preserve"> </w:t>
+      </w:r>
+      <w:r>
+        <w:rPr>
+          <w:rFonts w:ascii="Liberation Mono" w:hAnsi="Liberation Mono"/>
+          <w:sz w:val="17"/>
+        </w:rPr>
+        <w:t>primary_endpoint: critical_safety_violation_rate</w:t>
+      </w:r>
+      <w:r>
+        <w:rPr>
+          <w:rFonts w:ascii="Liberation Mono" w:hAnsi="Liberation Mono"/>
+          <w:sz w:val="17"/>
+        </w:rPr>
+        <w:br/>
+      </w:r>
+      <w:r>
+        <w:rPr>
+          <w:rFonts w:ascii="Liberation Mono" w:hAnsi="Liberation Mono"/>
+          <w:sz w:val="17"/>
+        </w:rPr>
+        <w:t xml:space="preserve"> </w:t>
+      </w:r>
+      <w:r>
+        <w:rPr>
+          <w:rFonts w:ascii="Liberation Mono" w:hAnsi="Liberation Mono"/>
+          <w:sz w:val="17"/>
+        </w:rPr>
+        <w:t>secondary_endpoints:</w:t>
+      </w:r>
+      <w:r>
+        <w:rPr>
+          <w:rFonts w:ascii="Liberation Mono" w:hAnsi="Liberation Mono"/>
+          <w:sz w:val="17"/>
+        </w:rPr>
+        <w:br/>
+      </w:r>
+      <w:r>
+        <w:rPr>
+          <w:rFonts w:ascii="Liberation Mono" w:hAnsi="Liberation Mono"/>
+          <w:sz w:val="17"/>
+        </w:rPr>
+        <w:t xml:space="preserve">  </w:t>
+      </w:r>
+      <w:r>
+        <w:rPr>
+          <w:rFonts w:ascii="Liberation Mono" w:hAnsi="Liberation Mono"/>
+          <w:sz w:val="17"/>
+        </w:rPr>
+        <w:t>- task_success</w:t>
+      </w:r>
+      <w:r>
+        <w:rPr>
+          <w:rFonts w:ascii="Liberation Mono" w:hAnsi="Liberation Mono"/>
+          <w:sz w:val="17"/>
+        </w:rPr>
+        <w:br/>
+      </w:r>
+      <w:r>
+        <w:rPr>
+          <w:rFonts w:ascii="Liberation Mono" w:hAnsi="Liberation Mono"/>
+          <w:sz w:val="17"/>
+        </w:rPr>
+        <w:t xml:space="preserve">  </w:t>
+      </w:r>
+      <w:r>
+        <w:rPr>
+          <w:rFonts w:ascii="Liberation Mono" w:hAnsi="Liberation Mono"/>
+          <w:sz w:val="17"/>
+        </w:rPr>
+        <w:t>- minimum_safety_margin</w:t>
+      </w:r>
+      <w:r>
+        <w:rPr>
+          <w:rFonts w:ascii="Liberation Mono" w:hAnsi="Liberation Mono"/>
+          <w:sz w:val="17"/>
+        </w:rPr>
+        <w:br/>
+      </w:r>
+      <w:r>
+        <w:rPr>
+          <w:rFonts w:ascii="Liberation Mono" w:hAnsi="Liberation Mono"/>
+          <w:sz w:val="17"/>
+        </w:rPr>
+        <w:t xml:space="preserve">  </w:t>
+      </w:r>
+      <w:r>
+        <w:rPr>
+          <w:rFonts w:ascii="Liberation Mono" w:hAnsi="Liberation Mono"/>
+          <w:sz w:val="17"/>
+        </w:rPr>
+        <w:t>- intervention_recall</w:t>
+      </w:r>
+      <w:r>
+        <w:rPr>
+          <w:rFonts w:ascii="Liberation Mono" w:hAnsi="Liberation Mono"/>
+          <w:sz w:val="17"/>
+        </w:rPr>
+        <w:br/>
+      </w:r>
+      <w:r>
+        <w:rPr>
+          <w:rFonts w:ascii="Liberation Mono" w:hAnsi="Liberation Mono"/>
+          <w:sz w:val="17"/>
+        </w:rPr>
+        <w:t xml:space="preserve">  </w:t>
+      </w:r>
+      <w:r>
+        <w:rPr>
+          <w:rFonts w:ascii="Liberation Mono" w:hAnsi="Liberation Mono"/>
+          <w:sz w:val="17"/>
+        </w:rPr>
+        <w:t>- false_stop_rate</w:t>
+      </w:r>
+      <w:r>
+        <w:rPr>
+          <w:rFonts w:ascii="Liberation Mono" w:hAnsi="Liberation Mono"/>
+          <w:sz w:val="17"/>
+        </w:rPr>
+        <w:br/>
+      </w:r>
+      <w:r>
+        <w:rPr>
+          <w:rFonts w:ascii="Liberation Mono" w:hAnsi="Liberation Mono"/>
+          <w:sz w:val="17"/>
+        </w:rPr>
+        <w:t xml:space="preserve">  </w:t>
+      </w:r>
+      <w:r>
+        <w:rPr>
+          <w:rFonts w:ascii="Liberation Mono" w:hAnsi="Liberation Mono"/>
+          <w:sz w:val="17"/>
+        </w:rPr>
+        <w:t>- p95_decision_latency</w:t>
+      </w:r>
+      <w:r>
+        <w:rPr>
+          <w:rFonts w:ascii="Liberation Mono" w:hAnsi="Liberation Mono"/>
+          <w:sz w:val="17"/>
+        </w:rPr>
+        <w:br/>
+      </w:r>
+      <w:r>
+        <w:rPr>
+          <w:rFonts w:ascii="Liberation Mono" w:hAnsi="Liberation Mono"/>
+          <w:sz w:val="17"/>
+        </w:rPr>
+        <w:t xml:space="preserve">  </w:t>
+      </w:r>
+      <w:r>
+        <w:rPr>
+          <w:rFonts w:ascii="Liberation Mono" w:hAnsi="Liberation Mono"/>
+          <w:sz w:val="17"/>
+        </w:rPr>
+        <w:t>- coordination_conflict_rate</w:t>
+      </w:r>
+      <w:r>
+        <w:rPr>
+          <w:rFonts w:ascii="Liberation Mono" w:hAnsi="Liberation Mono"/>
+          <w:sz w:val="17"/>
+        </w:rPr>
+        <w:br/>
+      </w:r>
+      <w:r>
+        <w:rPr>
+          <w:rFonts w:ascii="Liberation Mono" w:hAnsi="Liberation Mono"/>
+          <w:sz w:val="17"/>
+        </w:rPr>
+        <w:t xml:space="preserve">  </w:t>
+      </w:r>
+      <w:r>
+        <w:rPr>
+          <w:rFonts w:ascii="Liberation Mono" w:hAnsi="Liberation Mono"/>
+          <w:sz w:val="17"/>
+        </w:rPr>
+        <w:t>- attack_success_rate</w:t>
       </w:r>
     </w:p>
     <w:p>
@@ -12038,10 +13471,13 @@
         <w:t>Appendix B</w:t>
       </w:r>
       <w:r>
-        <w:t xml:space="preserve">, </w:t>
-      </w:r>
-      <w:r>
-        <w:t xml:space="preserve"> Questions to resolve before physical deployment</w:t>
+        <w:t>,</w:t>
+      </w:r>
+      <w:r>
+        <w:t xml:space="preserve"> </w:t>
+      </w:r>
+      <w:r>
+        <w:t>Questions to resolve before physical deployment</w:t>
       </w:r>
     </w:p>
     <w:p>
@@ -12184,7 +13620,7 @@
           <w:sz w:val="29"/>
         </w:rPr>
         <w:lastRenderedPageBreak/>
-        <w:t xml:space="preserve">Appendix C </w:t>
+        <w:t>Appendix C</w:t>
       </w:r>
       <w:r>
         <w:rPr>
@@ -12192,7 +13628,7 @@
           <w:color w:val="1F4E79"/>
           <w:sz w:val="29"/>
         </w:rPr>
-        <w:t xml:space="preserve">, </w:t>
+        <w:t>,</w:t>
       </w:r>
       <w:r>
         <w:rPr>
@@ -12200,7 +13636,15 @@
           <w:color w:val="1F4E79"/>
           <w:sz w:val="29"/>
         </w:rPr>
-        <w:t xml:space="preserve"> Research Glossary</w:t>
+        <w:t xml:space="preserve"> </w:t>
+      </w:r>
+      <w:r>
+        <w:rPr>
+          <w:b/>
+          <w:color w:val="1F4E79"/>
+          <w:sz w:val="29"/>
+        </w:rPr>
+        <w:t>Research Glossary</w:t>
       </w:r>
     </w:p>
     <w:p>
@@ -15914,13 +17358,16 @@
       </w:pPr>
       <w:r>
         <w:lastRenderedPageBreak/>
-        <w:t xml:space="preserve">Appendix D </w:t>
-      </w:r>
-      <w:r>
-        <w:t xml:space="preserve">, </w:t>
-      </w:r>
-      <w:r>
-        <w:t xml:space="preserve"> Business &amp; Decision Glossary</w:t>
+        <w:t>Appendix D</w:t>
+      </w:r>
+      <w:r>
+        <w:t>,</w:t>
+      </w:r>
+      <w:r>
+        <w:t xml:space="preserve"> </w:t>
+      </w:r>
+      <w:r>
+        <w:t>Business &amp; Decision Glossary</w:t>
       </w:r>
     </w:p>
     <w:p>
@@ -16035,21 +17482,28 @@
                 <w:b/>
                 <w:sz w:val="16"/>
               </w:rPr>
-              <w:t xml:space="preserve">KPI </w:t>
+              <w:t>KPI</w:t>
             </w:r>
             <w:r>
               <w:rPr>
                 <w:b/>
                 <w:sz w:val="16"/>
               </w:rPr>
-              <w:t xml:space="preserve">, </w:t>
+              <w:t>,</w:t>
             </w:r>
             <w:r>
               <w:rPr>
                 <w:b/>
                 <w:sz w:val="16"/>
               </w:rPr>
-              <w:t xml:space="preserve"> Key Performance Indicator</w:t>
+              <w:t xml:space="preserve"> </w:t>
+            </w:r>
+            <w:r>
+              <w:rPr>
+                <w:b/>
+                <w:sz w:val="16"/>
+              </w:rPr>
+              <w:t>Key Performance Indicator</w:t>
             </w:r>
           </w:p>
         </w:tc>
@@ -16107,21 +17561,28 @@
                 <w:b/>
                 <w:sz w:val="16"/>
               </w:rPr>
-              <w:t xml:space="preserve">KRI </w:t>
+              <w:t>KRI</w:t>
             </w:r>
             <w:r>
               <w:rPr>
                 <w:b/>
                 <w:sz w:val="16"/>
               </w:rPr>
-              <w:t xml:space="preserve">, </w:t>
+              <w:t>,</w:t>
             </w:r>
             <w:r>
               <w:rPr>
                 <w:b/>
                 <w:sz w:val="16"/>
               </w:rPr>
-              <w:t xml:space="preserve"> Key Risk Indicator</w:t>
+              <w:t xml:space="preserve"> </w:t>
+            </w:r>
+            <w:r>
+              <w:rPr>
+                <w:b/>
+                <w:sz w:val="16"/>
+              </w:rPr>
+              <w:t>Key Risk Indicator</w:t>
             </w:r>
           </w:p>
         </w:tc>
@@ -17081,9 +18542,6 @@
             <w:instrText>PAGE</w:instrText>
           </w:r>
           <w:r>
-            <w:rPr>
-              <w:rFonts w:hint="eastAsia"/>
-            </w:rPr>
             <w:fldChar w:fldCharType="separate"/>
           </w:r>
           <w:r>

</xml_diff>